<commit_message>
feat: implement RAG pipeline with ingestion, semantic search, and Groq-powered LLM response generation
</commit_message>
<xml_diff>
--- a/data/rag_file.docx
+++ b/data/rag_file.docx
@@ -6,20 +6,204 @@
       <w:pPr>
         <w:pStyle w:val="Heading1"/>
       </w:pPr>
-      <w:bookmarkStart w:id="0" w:name="Xb9af9788aac75ed3ac836151e1a447e55979eac"/>
-      <w:r>
-        <w:t>Eyob Hailu – RAG Knowledge Base Dataset (Qdrant Ready)</w:t>
+      <w:bookmarkStart w:id="0" w:name="profile"/>
+      <w:r>
+        <w:t>👤 PROFILE</w:t>
       </w:r>
     </w:p>
     <w:p>
       <w:pPr>
-        <w:pStyle w:val="FirstParagraph"/>
-      </w:pPr>
-      <w:r>
-        <w:t>This document contains a structured, production-ready knowledge base designed for storage in a vector database such as Qdrant. It is organized into semantic chunks for use in Retrieval-Augmented Generation (RAG) systems.</w:t>
+        <w:pStyle w:val="Heading2"/>
+      </w:pPr>
+      <w:bookmarkStart w:id="1" w:name="eyob-profile"/>
+      <w:r>
+        <w:t>Eyob Profile</w:t>
       </w:r>
     </w:p>
     <w:p>
+      <w:pPr>
+        <w:pStyle w:val="SourceCode"/>
+      </w:pPr>
+      <w:r>
+        <w:rPr>
+          <w:rStyle w:val="FunctionTok"/>
+        </w:rPr>
+        <w:t>{</w:t>
+      </w:r>
+      <w:r>
+        <w:br/>
+      </w:r>
+      <w:r>
+        <w:rPr>
+          <w:rStyle w:val="NormalTok"/>
+        </w:rPr>
+        <w:t xml:space="preserve">  </w:t>
+      </w:r>
+      <w:r>
+        <w:rPr>
+          <w:rStyle w:val="DataTypeTok"/>
+        </w:rPr>
+        <w:t>"id"</w:t>
+      </w:r>
+      <w:r>
+        <w:rPr>
+          <w:rStyle w:val="FunctionTok"/>
+        </w:rPr>
+        <w:t>:</w:t>
+      </w:r>
+      <w:r>
+        <w:rPr>
+          <w:rStyle w:val="NormalTok"/>
+        </w:rPr>
+        <w:t xml:space="preserve"> </w:t>
+      </w:r>
+      <w:r>
+        <w:rPr>
+          <w:rStyle w:val="StringTok"/>
+        </w:rPr>
+        <w:t>"eyob_profile"</w:t>
+      </w:r>
+      <w:r>
+        <w:rPr>
+          <w:rStyle w:val="FunctionTok"/>
+        </w:rPr>
+        <w:t>,</w:t>
+      </w:r>
+      <w:r>
+        <w:br/>
+      </w:r>
+      <w:r>
+        <w:rPr>
+          <w:rStyle w:val="NormalTok"/>
+        </w:rPr>
+        <w:t xml:space="preserve">  </w:t>
+      </w:r>
+      <w:r>
+        <w:rPr>
+          <w:rStyle w:val="DataTypeTok"/>
+        </w:rPr>
+        <w:t>"payload"</w:t>
+      </w:r>
+      <w:r>
+        <w:rPr>
+          <w:rStyle w:val="FunctionTok"/>
+        </w:rPr>
+        <w:t>:</w:t>
+      </w:r>
+      <w:r>
+        <w:rPr>
+          <w:rStyle w:val="NormalTok"/>
+        </w:rPr>
+        <w:t xml:space="preserve"> </w:t>
+      </w:r>
+      <w:r>
+        <w:rPr>
+          <w:rStyle w:val="FunctionTok"/>
+        </w:rPr>
+        <w:t>{</w:t>
+      </w:r>
+      <w:r>
+        <w:br/>
+      </w:r>
+      <w:r>
+        <w:rPr>
+          <w:rStyle w:val="NormalTok"/>
+        </w:rPr>
+        <w:t xml:space="preserve">    </w:t>
+      </w:r>
+      <w:r>
+        <w:rPr>
+          <w:rStyle w:val="DataTypeTok"/>
+        </w:rPr>
+        <w:t>"text"</w:t>
+      </w:r>
+      <w:r>
+        <w:rPr>
+          <w:rStyle w:val="FunctionTok"/>
+        </w:rPr>
+        <w:t>:</w:t>
+      </w:r>
+      <w:r>
+        <w:rPr>
+          <w:rStyle w:val="NormalTok"/>
+        </w:rPr>
+        <w:t xml:space="preserve"> </w:t>
+      </w:r>
+      <w:r>
+        <w:rPr>
+          <w:rStyle w:val="StringTok"/>
+        </w:rPr>
+        <w:t>"Eyob Hailu is a Computer Science graduate with a Bachelor of Science degree, graduating with a CGPA of 3.80 with great distinction."</w:t>
+      </w:r>
+      <w:r>
+        <w:rPr>
+          <w:rStyle w:val="FunctionTok"/>
+        </w:rPr>
+        <w:t>,</w:t>
+      </w:r>
+      <w:r>
+        <w:br/>
+      </w:r>
+      <w:r>
+        <w:rPr>
+          <w:rStyle w:val="NormalTok"/>
+        </w:rPr>
+        <w:t xml:space="preserve">    </w:t>
+      </w:r>
+      <w:r>
+        <w:rPr>
+          <w:rStyle w:val="DataTypeTok"/>
+        </w:rPr>
+        <w:t>"category"</w:t>
+      </w:r>
+      <w:r>
+        <w:rPr>
+          <w:rStyle w:val="FunctionTok"/>
+        </w:rPr>
+        <w:t>:</w:t>
+      </w:r>
+      <w:r>
+        <w:rPr>
+          <w:rStyle w:val="NormalTok"/>
+        </w:rPr>
+        <w:t xml:space="preserve"> </w:t>
+      </w:r>
+      <w:r>
+        <w:rPr>
+          <w:rStyle w:val="StringTok"/>
+        </w:rPr>
+        <w:t>"profile"</w:t>
+      </w:r>
+      <w:r>
+        <w:br/>
+      </w:r>
+      <w:r>
+        <w:rPr>
+          <w:rStyle w:val="NormalTok"/>
+        </w:rPr>
+        <w:t xml:space="preserve">  </w:t>
+      </w:r>
+      <w:r>
+        <w:rPr>
+          <w:rStyle w:val="FunctionTok"/>
+        </w:rPr>
+        <w:t>}</w:t>
+      </w:r>
+      <w:r>
+        <w:br/>
+      </w:r>
+      <w:r>
+        <w:rPr>
+          <w:rStyle w:val="FunctionTok"/>
+        </w:rPr>
+        <w:t>}</w:t>
+      </w:r>
+    </w:p>
+    <w:p>
+      <w:bookmarkStart w:id="2" w:name="leadership-experience"/>
+      <w:bookmarkStart w:id="3" w:name="_GoBack"/>
+      <w:bookmarkEnd w:id="1"/>
+      <w:bookmarkEnd w:id="3"/>
       <w:r>
         <w:pict>
           <v:rect id="_x0000_i1025" style="width:0;height:1.5pt" o:hralign="center" o:hrstd="t" o:hr="t"/>
@@ -30,22 +214,20 @@
       <w:pPr>
         <w:pStyle w:val="Heading1"/>
       </w:pPr>
-      <w:bookmarkStart w:id="1" w:name="profile"/>
+      <w:bookmarkStart w:id="4" w:name="skills-software-engineering"/>
       <w:bookmarkEnd w:id="0"/>
-      <w:r>
-        <w:t>👤</w:t>
-      </w:r>
-      <w:r>
-        <w:t xml:space="preserve"> PROFILE</w:t>
+      <w:bookmarkEnd w:id="2"/>
+      <w:r>
+        <w:t>🧠 SKILLS (SOFTWARE ENGINEERING)</w:t>
       </w:r>
     </w:p>
     <w:p>
       <w:pPr>
         <w:pStyle w:val="Heading2"/>
       </w:pPr>
-      <w:bookmarkStart w:id="2" w:name="eyob-profile"/>
-      <w:r>
-        <w:t>Eyob Profile</w:t>
+      <w:bookmarkStart w:id="5" w:name="full-stack-development-skills"/>
+      <w:r>
+        <w:t>Full-Stack Development Skills</w:t>
       </w:r>
     </w:p>
     <w:p>
@@ -61,6 +243,53 @@
       <w:r>
         <w:br/>
       </w:r>
+      <w:proofErr w:type="gramStart"/>
+      <w:r>
+        <w:rPr>
+          <w:rStyle w:val="NormalTok"/>
+        </w:rPr>
+        <w:t xml:space="preserve"> </w:t>
+      </w:r>
+      <w:proofErr w:type="gramEnd"/>
+      <w:r>
+        <w:rPr>
+          <w:rStyle w:val="NormalTok"/>
+        </w:rPr>
+        <w:t xml:space="preserve"> </w:t>
+      </w:r>
+      <w:r>
+        <w:rPr>
+          <w:rStyle w:val="DataTypeTok"/>
+        </w:rPr>
+        <w:t>"id"</w:t>
+      </w:r>
+      <w:r>
+        <w:rPr>
+          <w:rStyle w:val="FunctionTok"/>
+        </w:rPr>
+        <w:t>:</w:t>
+      </w:r>
+      <w:r>
+        <w:rPr>
+          <w:rStyle w:val="NormalTok"/>
+        </w:rPr>
+        <w:t xml:space="preserve"> </w:t>
+      </w:r>
+      <w:r>
+        <w:rPr>
+          <w:rStyle w:val="StringTok"/>
+        </w:rPr>
+        <w:t>"eyob_skills_fullstack"</w:t>
+      </w:r>
+      <w:r>
+        <w:rPr>
+          <w:rStyle w:val="FunctionTok"/>
+        </w:rPr>
+        <w:t>,</w:t>
+      </w:r>
+      <w:r>
+        <w:br/>
+      </w:r>
       <w:r>
         <w:rPr>
           <w:rStyle w:val="NormalTok"/>
@@ -71,25 +300,78 @@
         <w:rPr>
           <w:rStyle w:val="DataTypeTok"/>
         </w:rPr>
-        <w:t>"id"</w:t>
-      </w:r>
-      <w:r>
-        <w:rPr>
-          <w:rStyle w:val="FunctionTok"/>
-        </w:rPr>
-        <w:t>:</w:t>
-      </w:r>
-      <w:r>
-        <w:rPr>
-          <w:rStyle w:val="NormalTok"/>
-        </w:rPr>
-        <w:t xml:space="preserve"> </w:t>
-      </w:r>
-      <w:r>
-        <w:rPr>
-          <w:rStyle w:val="StringTok"/>
-        </w:rPr>
-        <w:t>"eyob_profile"</w:t>
+        <w:t>"payload"</w:t>
+      </w:r>
+      <w:r>
+        <w:rPr>
+          <w:rStyle w:val="FunctionTok"/>
+        </w:rPr>
+        <w:t>:</w:t>
+      </w:r>
+      <w:r>
+        <w:rPr>
+          <w:rStyle w:val="NormalTok"/>
+        </w:rPr>
+        <w:t xml:space="preserve"> </w:t>
+      </w:r>
+      <w:r>
+        <w:rPr>
+          <w:rStyle w:val="FunctionTok"/>
+        </w:rPr>
+        <w:t>{</w:t>
+      </w:r>
+      <w:r>
+        <w:br/>
+      </w:r>
+      <w:r>
+        <w:rPr>
+          <w:rStyle w:val="NormalTok"/>
+        </w:rPr>
+        <w:t xml:space="preserve">    </w:t>
+      </w:r>
+      <w:r>
+        <w:rPr>
+          <w:rStyle w:val="DataTypeTok"/>
+        </w:rPr>
+        <w:t>"text"</w:t>
+      </w:r>
+      <w:r>
+        <w:rPr>
+          <w:rStyle w:val="FunctionTok"/>
+        </w:rPr>
+        <w:t>:</w:t>
+      </w:r>
+      <w:r>
+        <w:rPr>
+          <w:rStyle w:val="NormalTok"/>
+        </w:rPr>
+        <w:t xml:space="preserve"> </w:t>
+      </w:r>
+      <w:r>
+        <w:rPr>
+          <w:rStyle w:val="StringTok"/>
+        </w:rPr>
+        <w:t xml:space="preserve">"Eyob has strong full-stack development skills including Angular, React, Node.js, </w:t>
+      </w:r>
+      <w:proofErr w:type="spellStart"/>
+      <w:r>
+        <w:rPr>
+          <w:rStyle w:val="StringTok"/>
+        </w:rPr>
+        <w:t>Express,</w:t>
+      </w:r>
+      <w:r>
+        <w:rPr>
+          <w:rStyle w:val="StringTok"/>
+        </w:rPr>
+        <w:t>NestJs</w:t>
+      </w:r>
+      <w:proofErr w:type="spellEnd"/>
+      <w:r>
+        <w:rPr>
+          <w:rStyle w:val="StringTok"/>
+        </w:rPr>
+        <w:t xml:space="preserve"> and Spring Boot for backend systems."</w:t>
       </w:r>
       <w:r>
         <w:rPr>
@@ -104,84 +386,12 @@
         <w:rPr>
           <w:rStyle w:val="NormalTok"/>
         </w:rPr>
-        <w:t xml:space="preserve">  </w:t>
-      </w:r>
-      <w:r>
-        <w:rPr>
-          <w:rStyle w:val="DataTypeTok"/>
-        </w:rPr>
-        <w:t>"payload"</w:t>
-      </w:r>
-      <w:r>
-        <w:rPr>
-          <w:rStyle w:val="FunctionTok"/>
-        </w:rPr>
-        <w:t>:</w:t>
-      </w:r>
-      <w:r>
-        <w:rPr>
-          <w:rStyle w:val="NormalTok"/>
-        </w:rPr>
-        <w:t xml:space="preserve"> </w:t>
-      </w:r>
-      <w:r>
-        <w:rPr>
-          <w:rStyle w:val="FunctionTok"/>
-        </w:rPr>
-        <w:t>{</w:t>
-      </w:r>
-      <w:r>
-        <w:br/>
-      </w:r>
-      <w:r>
-        <w:rPr>
-          <w:rStyle w:val="NormalTok"/>
-        </w:rPr>
         <w:t xml:space="preserve">    </w:t>
       </w:r>
       <w:r>
         <w:rPr>
           <w:rStyle w:val="DataTypeTok"/>
         </w:rPr>
-        <w:t>"text"</w:t>
-      </w:r>
-      <w:r>
-        <w:rPr>
-          <w:rStyle w:val="FunctionTok"/>
-        </w:rPr>
-        <w:t>:</w:t>
-      </w:r>
-      <w:r>
-        <w:rPr>
-          <w:rStyle w:val="NormalTok"/>
-        </w:rPr>
-        <w:t xml:space="preserve"> </w:t>
-      </w:r>
-      <w:r>
-        <w:rPr>
-          <w:rStyle w:val="StringTok"/>
-        </w:rPr>
-        <w:t>"Eyob Hailu is a Computer Science graduate with a Bachelor of Science degree, graduating with a CGPA of 3.80 with great distinction."</w:t>
-      </w:r>
-      <w:r>
-        <w:rPr>
-          <w:rStyle w:val="FunctionTok"/>
-        </w:rPr>
-        <w:t>,</w:t>
-      </w:r>
-      <w:r>
-        <w:br/>
-      </w:r>
-      <w:r>
-        <w:rPr>
-          <w:rStyle w:val="NormalTok"/>
-        </w:rPr>
-        <w:t xml:space="preserve">    </w:t>
-      </w:r>
-      <w:r>
-        <w:rPr>
-          <w:rStyle w:val="DataTypeTok"/>
-        </w:rPr>
         <w:t>"category"</w:t>
       </w:r>
       <w:r>
@@ -200,7 +410,7 @@
         <w:rPr>
           <w:rStyle w:val="StringTok"/>
         </w:rPr>
-        <w:t>"profile"</w:t>
+        <w:t>"skills"</w:t>
       </w:r>
       <w:r>
         <w:br/>
@@ -231,10 +441,10 @@
       <w:pPr>
         <w:pStyle w:val="Heading2"/>
       </w:pPr>
-      <w:bookmarkStart w:id="3" w:name="leadership-experience"/>
-      <w:bookmarkEnd w:id="2"/>
-      <w:r>
-        <w:t>Leadership Experience</w:t>
+      <w:bookmarkStart w:id="6" w:name="backend-development-skills"/>
+      <w:bookmarkEnd w:id="5"/>
+      <w:r>
+        <w:t>Backend Development Skills</w:t>
       </w:r>
     </w:p>
     <w:p>
@@ -278,13 +488,7 @@
         <w:rPr>
           <w:rStyle w:val="StringTok"/>
         </w:rPr>
-        <w:t>"eyob_leaders</w:t>
-      </w:r>
-      <w:r>
-        <w:rPr>
-          <w:rStyle w:val="StringTok"/>
-        </w:rPr>
-        <w:t>hip"</w:t>
+        <w:t>"eyob_skills_backend"</w:t>
       </w:r>
       <w:r>
         <w:rPr>
@@ -356,7 +560,7 @@
         <w:rPr>
           <w:rStyle w:val="StringTok"/>
         </w:rPr>
-        <w:t>"He served as a class representative and was a member of a peace forum during his university studies at Assosa University."</w:t>
+        <w:t>"He has experience building REST APIs using Spring Boot and working with Oracle SQL and MongoDB databases."</w:t>
       </w:r>
       <w:r>
         <w:rPr>
@@ -395,7 +599,7 @@
         <w:rPr>
           <w:rStyle w:val="StringTok"/>
         </w:rPr>
-        <w:t>"leadership"</w:t>
+        <w:t>"skills"</w:t>
       </w:r>
       <w:r>
         <w:br/>
@@ -423,7 +627,197 @@
       </w:r>
     </w:p>
     <w:p>
-      <w:r>
+      <w:pPr>
+        <w:pStyle w:val="Heading2"/>
+      </w:pPr>
+      <w:bookmarkStart w:id="7" w:name="development-tools"/>
+      <w:bookmarkEnd w:id="6"/>
+      <w:r>
+        <w:t>Development Tools</w:t>
+      </w:r>
+    </w:p>
+    <w:p>
+      <w:pPr>
+        <w:pStyle w:val="SourceCode"/>
+      </w:pPr>
+      <w:r>
+        <w:rPr>
+          <w:rStyle w:val="FunctionTok"/>
+        </w:rPr>
+        <w:t>{</w:t>
+      </w:r>
+      <w:r>
+        <w:br/>
+      </w:r>
+      <w:r>
+        <w:rPr>
+          <w:rStyle w:val="NormalTok"/>
+        </w:rPr>
+        <w:t xml:space="preserve">  </w:t>
+      </w:r>
+      <w:r>
+        <w:rPr>
+          <w:rStyle w:val="DataTypeTok"/>
+        </w:rPr>
+        <w:t>"id"</w:t>
+      </w:r>
+      <w:r>
+        <w:rPr>
+          <w:rStyle w:val="FunctionTok"/>
+        </w:rPr>
+        <w:t>:</w:t>
+      </w:r>
+      <w:r>
+        <w:rPr>
+          <w:rStyle w:val="NormalTok"/>
+        </w:rPr>
+        <w:t xml:space="preserve"> </w:t>
+      </w:r>
+      <w:r>
+        <w:rPr>
+          <w:rStyle w:val="StringTok"/>
+        </w:rPr>
+        <w:t>"eyob_tools"</w:t>
+      </w:r>
+      <w:r>
+        <w:rPr>
+          <w:rStyle w:val="FunctionTok"/>
+        </w:rPr>
+        <w:t>,</w:t>
+      </w:r>
+      <w:r>
+        <w:br/>
+      </w:r>
+      <w:r>
+        <w:rPr>
+          <w:rStyle w:val="NormalTok"/>
+        </w:rPr>
+        <w:t xml:space="preserve">  </w:t>
+      </w:r>
+      <w:r>
+        <w:rPr>
+          <w:rStyle w:val="DataTypeTok"/>
+        </w:rPr>
+        <w:t>"payload"</w:t>
+      </w:r>
+      <w:r>
+        <w:rPr>
+          <w:rStyle w:val="FunctionTok"/>
+        </w:rPr>
+        <w:t>:</w:t>
+      </w:r>
+      <w:r>
+        <w:rPr>
+          <w:rStyle w:val="NormalTok"/>
+        </w:rPr>
+        <w:t xml:space="preserve"> </w:t>
+      </w:r>
+      <w:r>
+        <w:rPr>
+          <w:rStyle w:val="FunctionTok"/>
+        </w:rPr>
+        <w:t>{</w:t>
+      </w:r>
+      <w:r>
+        <w:br/>
+      </w:r>
+      <w:r>
+        <w:rPr>
+          <w:rStyle w:val="NormalTok"/>
+        </w:rPr>
+        <w:t xml:space="preserve">    </w:t>
+      </w:r>
+      <w:r>
+        <w:rPr>
+          <w:rStyle w:val="DataTypeTok"/>
+        </w:rPr>
+        <w:t>"text"</w:t>
+      </w:r>
+      <w:r>
+        <w:rPr>
+          <w:rStyle w:val="FunctionTok"/>
+        </w:rPr>
+        <w:t>:</w:t>
+      </w:r>
+      <w:r>
+        <w:rPr>
+          <w:rStyle w:val="NormalTok"/>
+        </w:rPr>
+        <w:t xml:space="preserve"> </w:t>
+      </w:r>
+      <w:r>
+        <w:rPr>
+          <w:rStyle w:val="StringTok"/>
+        </w:rPr>
+        <w:t>"He uses Git for version control and works with modern software development workflows for collaborative projects."</w:t>
+      </w:r>
+      <w:r>
+        <w:rPr>
+          <w:rStyle w:val="FunctionTok"/>
+        </w:rPr>
+        <w:t>,</w:t>
+      </w:r>
+      <w:r>
+        <w:br/>
+      </w:r>
+      <w:r>
+        <w:rPr>
+          <w:rStyle w:val="NormalTok"/>
+        </w:rPr>
+        <w:t xml:space="preserve">    </w:t>
+      </w:r>
+      <w:r>
+        <w:rPr>
+          <w:rStyle w:val="DataTypeTok"/>
+        </w:rPr>
+        <w:t>"category"</w:t>
+      </w:r>
+      <w:r>
+        <w:rPr>
+          <w:rStyle w:val="FunctionTok"/>
+        </w:rPr>
+        <w:t>:</w:t>
+      </w:r>
+      <w:r>
+        <w:rPr>
+          <w:rStyle w:val="NormalTok"/>
+        </w:rPr>
+        <w:t xml:space="preserve"> </w:t>
+      </w:r>
+      <w:r>
+        <w:rPr>
+          <w:rStyle w:val="StringTok"/>
+        </w:rPr>
+        <w:t>"skills"</w:t>
+      </w:r>
+      <w:r>
+        <w:br/>
+      </w:r>
+      <w:r>
+        <w:rPr>
+          <w:rStyle w:val="NormalTok"/>
+        </w:rPr>
+        <w:t xml:space="preserve">  </w:t>
+      </w:r>
+      <w:r>
+        <w:rPr>
+          <w:rStyle w:val="FunctionTok"/>
+        </w:rPr>
+        <w:t>}</w:t>
+      </w:r>
+      <w:r>
+        <w:br/>
+      </w:r>
+      <w:r>
+        <w:rPr>
+          <w:rStyle w:val="FunctionTok"/>
+        </w:rPr>
+        <w:t>}</w:t>
+      </w:r>
+    </w:p>
+    <w:p>
+      <w:r>
+        <w:lastRenderedPageBreak/>
         <w:pict>
           <v:rect id="_x0000_i1026" style="width:0;height:1.5pt" o:hralign="center" o:hrstd="t" o:hr="t"/>
         </w:pict>
@@ -433,639 +827,11 @@
       <w:pPr>
         <w:pStyle w:val="Heading1"/>
       </w:pPr>
-      <w:bookmarkStart w:id="4" w:name="skills-software-engineering"/>
-      <w:bookmarkEnd w:id="1"/>
-      <w:bookmarkEnd w:id="3"/>
-      <w:r>
-        <w:t>🧠</w:t>
-      </w:r>
-      <w:r>
-        <w:t xml:space="preserve"> SKILLS (SOFTWARE ENGINEERING)</w:t>
-      </w:r>
-    </w:p>
-    <w:p>
-      <w:pPr>
-        <w:pStyle w:val="Heading2"/>
-      </w:pPr>
-      <w:bookmarkStart w:id="5" w:name="full-stack-development-skills"/>
-      <w:r>
-        <w:t>Full-Stack Development Skill</w:t>
-      </w:r>
-      <w:r>
-        <w:t>s</w:t>
-      </w:r>
-    </w:p>
-    <w:p>
-      <w:pPr>
-        <w:pStyle w:val="SourceCode"/>
-      </w:pPr>
-      <w:r>
-        <w:rPr>
-          <w:rStyle w:val="FunctionTok"/>
-        </w:rPr>
-        <w:t>{</w:t>
-      </w:r>
-      <w:r>
-        <w:br/>
-      </w:r>
-      <w:proofErr w:type="gramStart"/>
-      <w:r>
-        <w:rPr>
-          <w:rStyle w:val="NormalTok"/>
-        </w:rPr>
-        <w:t xml:space="preserve"> </w:t>
-      </w:r>
-      <w:proofErr w:type="gramEnd"/>
-      <w:r>
-        <w:rPr>
-          <w:rStyle w:val="NormalTok"/>
-        </w:rPr>
-        <w:t xml:space="preserve"> </w:t>
-      </w:r>
-      <w:r>
-        <w:rPr>
-          <w:rStyle w:val="DataTypeTok"/>
-        </w:rPr>
-        <w:t>"id"</w:t>
-      </w:r>
-      <w:r>
-        <w:rPr>
-          <w:rStyle w:val="FunctionTok"/>
-        </w:rPr>
-        <w:t>:</w:t>
-      </w:r>
-      <w:r>
-        <w:rPr>
-          <w:rStyle w:val="NormalTok"/>
-        </w:rPr>
-        <w:t xml:space="preserve"> </w:t>
-      </w:r>
-      <w:r>
-        <w:rPr>
-          <w:rStyle w:val="StringTok"/>
-        </w:rPr>
-        <w:t>"eyob_skills_fullstack"</w:t>
-      </w:r>
-      <w:r>
-        <w:rPr>
-          <w:rStyle w:val="FunctionTok"/>
-        </w:rPr>
-        <w:t>,</w:t>
-      </w:r>
-      <w:r>
-        <w:br/>
-      </w:r>
-      <w:r>
-        <w:rPr>
-          <w:rStyle w:val="NormalTok"/>
-        </w:rPr>
-        <w:t xml:space="preserve">  </w:t>
-      </w:r>
-      <w:r>
-        <w:rPr>
-          <w:rStyle w:val="DataTypeTok"/>
-        </w:rPr>
-        <w:t>"payload"</w:t>
-      </w:r>
-      <w:r>
-        <w:rPr>
-          <w:rStyle w:val="FunctionTok"/>
-        </w:rPr>
-        <w:t>:</w:t>
-      </w:r>
-      <w:r>
-        <w:rPr>
-          <w:rStyle w:val="NormalTok"/>
-        </w:rPr>
-        <w:t xml:space="preserve"> </w:t>
-      </w:r>
-      <w:r>
-        <w:rPr>
-          <w:rStyle w:val="FunctionTok"/>
-        </w:rPr>
-        <w:t>{</w:t>
-      </w:r>
-      <w:r>
-        <w:br/>
-      </w:r>
-      <w:r>
-        <w:rPr>
-          <w:rStyle w:val="NormalTok"/>
-        </w:rPr>
-        <w:t xml:space="preserve">    </w:t>
-      </w:r>
-      <w:r>
-        <w:rPr>
-          <w:rStyle w:val="DataTypeTok"/>
-        </w:rPr>
-        <w:t>"text"</w:t>
-      </w:r>
-      <w:r>
-        <w:rPr>
-          <w:rStyle w:val="FunctionTok"/>
-        </w:rPr>
-        <w:t>:</w:t>
-      </w:r>
-      <w:r>
-        <w:rPr>
-          <w:rStyle w:val="NormalTok"/>
-        </w:rPr>
-        <w:t xml:space="preserve"> </w:t>
-      </w:r>
-      <w:r>
-        <w:rPr>
-          <w:rStyle w:val="StringTok"/>
-        </w:rPr>
-        <w:t xml:space="preserve">"Eyob has strong full-stack development skills including Angular, React, Node.js, </w:t>
-      </w:r>
-      <w:proofErr w:type="spellStart"/>
-      <w:r>
-        <w:rPr>
-          <w:rStyle w:val="StringTok"/>
-        </w:rPr>
-        <w:t>Express,</w:t>
-      </w:r>
-      <w:r>
-        <w:rPr>
-          <w:rStyle w:val="StringTok"/>
-        </w:rPr>
-        <w:t>NestJs</w:t>
-      </w:r>
-      <w:proofErr w:type="spellEnd"/>
-      <w:r>
-        <w:rPr>
-          <w:rStyle w:val="StringTok"/>
-        </w:rPr>
-        <w:t xml:space="preserve"> and Spring Boot for backend systems."</w:t>
-      </w:r>
-      <w:r>
-        <w:rPr>
-          <w:rStyle w:val="FunctionTok"/>
-        </w:rPr>
-        <w:t>,</w:t>
-      </w:r>
-      <w:r>
-        <w:br/>
-      </w:r>
-      <w:r>
-        <w:rPr>
-          <w:rStyle w:val="NormalTok"/>
-        </w:rPr>
-        <w:t xml:space="preserve">    </w:t>
-      </w:r>
-      <w:r>
-        <w:rPr>
-          <w:rStyle w:val="DataTypeTok"/>
-        </w:rPr>
-        <w:t>"category"</w:t>
-      </w:r>
-      <w:r>
-        <w:rPr>
-          <w:rStyle w:val="FunctionTok"/>
-        </w:rPr>
-        <w:t>:</w:t>
-      </w:r>
-      <w:r>
-        <w:rPr>
-          <w:rStyle w:val="NormalTok"/>
-        </w:rPr>
-        <w:t xml:space="preserve"> </w:t>
-      </w:r>
-      <w:r>
-        <w:rPr>
-          <w:rStyle w:val="StringTok"/>
-        </w:rPr>
-        <w:t>"skills"</w:t>
-      </w:r>
-      <w:r>
-        <w:br/>
-      </w:r>
-      <w:r>
-        <w:rPr>
-          <w:rStyle w:val="NormalTok"/>
-        </w:rPr>
-        <w:t xml:space="preserve">  </w:t>
-      </w:r>
-      <w:r>
-        <w:rPr>
-          <w:rStyle w:val="FunctionTok"/>
-        </w:rPr>
-        <w:t>}</w:t>
-      </w:r>
-      <w:r>
-        <w:br/>
-      </w:r>
-      <w:r>
-        <w:rPr>
-          <w:rStyle w:val="FunctionTok"/>
-        </w:rPr>
-        <w:t>}</w:t>
-      </w:r>
-    </w:p>
-    <w:p>
-      <w:pPr>
-        <w:pStyle w:val="Heading2"/>
-      </w:pPr>
-      <w:bookmarkStart w:id="6" w:name="backend-development-skills"/>
-      <w:bookmarkEnd w:id="5"/>
-      <w:r>
-        <w:lastRenderedPageBreak/>
-        <w:t>Backend Development Skills</w:t>
-      </w:r>
-    </w:p>
-    <w:p>
-      <w:pPr>
-        <w:pStyle w:val="SourceCode"/>
-      </w:pPr>
-      <w:r>
-        <w:rPr>
-          <w:rStyle w:val="FunctionTok"/>
-        </w:rPr>
-        <w:t>{</w:t>
-      </w:r>
-      <w:r>
-        <w:br/>
-      </w:r>
-      <w:r>
-        <w:rPr>
-          <w:rStyle w:val="NormalTok"/>
-        </w:rPr>
-        <w:t xml:space="preserve">  </w:t>
-      </w:r>
-      <w:r>
-        <w:rPr>
-          <w:rStyle w:val="DataTypeTok"/>
-        </w:rPr>
-        <w:t>"id"</w:t>
-      </w:r>
-      <w:r>
-        <w:rPr>
-          <w:rStyle w:val="FunctionTok"/>
-        </w:rPr>
-        <w:t>:</w:t>
-      </w:r>
-      <w:r>
-        <w:rPr>
-          <w:rStyle w:val="NormalTok"/>
-        </w:rPr>
-        <w:t xml:space="preserve"> </w:t>
-      </w:r>
-      <w:r>
-        <w:rPr>
-          <w:rStyle w:val="StringTok"/>
-        </w:rPr>
-        <w:t>"eyob_skills_backend"</w:t>
-      </w:r>
-      <w:r>
-        <w:rPr>
-          <w:rStyle w:val="FunctionTok"/>
-        </w:rPr>
-        <w:t>,</w:t>
-      </w:r>
-      <w:r>
-        <w:br/>
-      </w:r>
-      <w:r>
-        <w:rPr>
-          <w:rStyle w:val="NormalTok"/>
-        </w:rPr>
-        <w:t xml:space="preserve">  </w:t>
-      </w:r>
-      <w:r>
-        <w:rPr>
-          <w:rStyle w:val="DataTypeTok"/>
-        </w:rPr>
-        <w:t>"payload"</w:t>
-      </w:r>
-      <w:r>
-        <w:rPr>
-          <w:rStyle w:val="FunctionTok"/>
-        </w:rPr>
-        <w:t>:</w:t>
-      </w:r>
-      <w:r>
-        <w:rPr>
-          <w:rStyle w:val="NormalTok"/>
-        </w:rPr>
-        <w:t xml:space="preserve"> </w:t>
-      </w:r>
-      <w:r>
-        <w:rPr>
-          <w:rStyle w:val="FunctionTok"/>
-        </w:rPr>
-        <w:t>{</w:t>
-      </w:r>
-      <w:r>
-        <w:br/>
-      </w:r>
-      <w:r>
-        <w:rPr>
-          <w:rStyle w:val="NormalTok"/>
-        </w:rPr>
-        <w:t xml:space="preserve">    </w:t>
-      </w:r>
-      <w:r>
-        <w:rPr>
-          <w:rStyle w:val="DataTypeTok"/>
-        </w:rPr>
-        <w:t>"text"</w:t>
-      </w:r>
-      <w:r>
-        <w:rPr>
-          <w:rStyle w:val="FunctionTok"/>
-        </w:rPr>
-        <w:t>:</w:t>
-      </w:r>
-      <w:r>
-        <w:rPr>
-          <w:rStyle w:val="NormalTok"/>
-        </w:rPr>
-        <w:t xml:space="preserve"> </w:t>
-      </w:r>
-      <w:r>
-        <w:rPr>
-          <w:rStyle w:val="StringTok"/>
-        </w:rPr>
-        <w:t>"He has experience building REST APIs using Spring Boot and working with Oracle SQL and MongoDB databases."</w:t>
-      </w:r>
-      <w:r>
-        <w:rPr>
-          <w:rStyle w:val="FunctionTok"/>
-        </w:rPr>
-        <w:t>,</w:t>
-      </w:r>
-      <w:r>
-        <w:br/>
-      </w:r>
-      <w:r>
-        <w:rPr>
-          <w:rStyle w:val="NormalTok"/>
-        </w:rPr>
-        <w:t xml:space="preserve">    </w:t>
-      </w:r>
-      <w:r>
-        <w:rPr>
-          <w:rStyle w:val="DataTypeTok"/>
-        </w:rPr>
-        <w:t>"category"</w:t>
-      </w:r>
-      <w:r>
-        <w:rPr>
-          <w:rStyle w:val="FunctionTok"/>
-        </w:rPr>
-        <w:t>:</w:t>
-      </w:r>
-      <w:r>
-        <w:rPr>
-          <w:rStyle w:val="NormalTok"/>
-        </w:rPr>
-        <w:t xml:space="preserve"> </w:t>
-      </w:r>
-      <w:r>
-        <w:rPr>
-          <w:rStyle w:val="StringTok"/>
-        </w:rPr>
-        <w:t>"skills"</w:t>
-      </w:r>
-      <w:r>
-        <w:br/>
-      </w:r>
-      <w:r>
-        <w:rPr>
-          <w:rStyle w:val="NormalTok"/>
-        </w:rPr>
-        <w:t xml:space="preserve">  </w:t>
-      </w:r>
-      <w:r>
-        <w:rPr>
-          <w:rStyle w:val="FunctionTok"/>
-        </w:rPr>
-        <w:t>}</w:t>
-      </w:r>
-      <w:r>
-        <w:br/>
-      </w:r>
-      <w:r>
-        <w:rPr>
-          <w:rStyle w:val="FunctionTok"/>
-        </w:rPr>
-        <w:t>}</w:t>
-      </w:r>
-    </w:p>
-    <w:p>
-      <w:pPr>
-        <w:pStyle w:val="Heading2"/>
-      </w:pPr>
-      <w:bookmarkStart w:id="7" w:name="development-tools"/>
-      <w:bookmarkEnd w:id="6"/>
-      <w:r>
-        <w:t>Development Tools</w:t>
-      </w:r>
-    </w:p>
-    <w:p>
-      <w:pPr>
-        <w:pStyle w:val="SourceCode"/>
-      </w:pPr>
-      <w:r>
-        <w:rPr>
-          <w:rStyle w:val="FunctionTok"/>
-        </w:rPr>
-        <w:t>{</w:t>
-      </w:r>
-      <w:r>
-        <w:br/>
-      </w:r>
-      <w:r>
-        <w:rPr>
-          <w:rStyle w:val="NormalTok"/>
-        </w:rPr>
-        <w:t xml:space="preserve">  </w:t>
-      </w:r>
-      <w:r>
-        <w:rPr>
-          <w:rStyle w:val="DataTypeTok"/>
-        </w:rPr>
-        <w:t>"id"</w:t>
-      </w:r>
-      <w:r>
-        <w:rPr>
-          <w:rStyle w:val="FunctionTok"/>
-        </w:rPr>
-        <w:t>:</w:t>
-      </w:r>
-      <w:r>
-        <w:rPr>
-          <w:rStyle w:val="NormalTok"/>
-        </w:rPr>
-        <w:t xml:space="preserve"> </w:t>
-      </w:r>
-      <w:r>
-        <w:rPr>
-          <w:rStyle w:val="StringTok"/>
-        </w:rPr>
-        <w:t>"eyob_tools"</w:t>
-      </w:r>
-      <w:r>
-        <w:rPr>
-          <w:rStyle w:val="FunctionTok"/>
-        </w:rPr>
-        <w:t>,</w:t>
-      </w:r>
-      <w:r>
-        <w:br/>
-      </w:r>
-      <w:r>
-        <w:rPr>
-          <w:rStyle w:val="NormalTok"/>
-        </w:rPr>
-        <w:t xml:space="preserve">  </w:t>
-      </w:r>
-      <w:r>
-        <w:rPr>
-          <w:rStyle w:val="DataTypeTok"/>
-        </w:rPr>
-        <w:t>"payload"</w:t>
-      </w:r>
-      <w:r>
-        <w:rPr>
-          <w:rStyle w:val="FunctionTok"/>
-        </w:rPr>
-        <w:t>:</w:t>
-      </w:r>
-      <w:r>
-        <w:rPr>
-          <w:rStyle w:val="NormalTok"/>
-        </w:rPr>
-        <w:t xml:space="preserve"> </w:t>
-      </w:r>
-      <w:r>
-        <w:rPr>
-          <w:rStyle w:val="FunctionTok"/>
-        </w:rPr>
-        <w:t>{</w:t>
-      </w:r>
-      <w:r>
-        <w:br/>
-      </w:r>
-      <w:r>
-        <w:rPr>
-          <w:rStyle w:val="NormalTok"/>
-        </w:rPr>
-        <w:t xml:space="preserve">   </w:t>
-      </w:r>
-      <w:r>
-        <w:rPr>
-          <w:rStyle w:val="NormalTok"/>
-        </w:rPr>
-        <w:t xml:space="preserve"> </w:t>
-      </w:r>
-      <w:r>
-        <w:rPr>
-          <w:rStyle w:val="DataTypeTok"/>
-        </w:rPr>
-        <w:t>"text"</w:t>
-      </w:r>
-      <w:r>
-        <w:rPr>
-          <w:rStyle w:val="FunctionTok"/>
-        </w:rPr>
-        <w:t>:</w:t>
-      </w:r>
-      <w:r>
-        <w:rPr>
-          <w:rStyle w:val="NormalTok"/>
-        </w:rPr>
-        <w:t xml:space="preserve"> </w:t>
-      </w:r>
-      <w:r>
-        <w:rPr>
-          <w:rStyle w:val="StringTok"/>
-        </w:rPr>
-        <w:t>"He uses Git for version control and works with modern software development workflows for collaborative projects."</w:t>
-      </w:r>
-      <w:r>
-        <w:rPr>
-          <w:rStyle w:val="FunctionTok"/>
-        </w:rPr>
-        <w:t>,</w:t>
-      </w:r>
-      <w:r>
-        <w:br/>
-      </w:r>
-      <w:r>
-        <w:rPr>
-          <w:rStyle w:val="NormalTok"/>
-        </w:rPr>
-        <w:t xml:space="preserve">    </w:t>
-      </w:r>
-      <w:r>
-        <w:rPr>
-          <w:rStyle w:val="DataTypeTok"/>
-        </w:rPr>
-        <w:t>"category"</w:t>
-      </w:r>
-      <w:r>
-        <w:rPr>
-          <w:rStyle w:val="FunctionTok"/>
-        </w:rPr>
-        <w:t>:</w:t>
-      </w:r>
-      <w:r>
-        <w:rPr>
-          <w:rStyle w:val="NormalTok"/>
-        </w:rPr>
-        <w:t xml:space="preserve"> </w:t>
-      </w:r>
-      <w:r>
-        <w:rPr>
-          <w:rStyle w:val="StringTok"/>
-        </w:rPr>
-        <w:t>"skills"</w:t>
-      </w:r>
-      <w:r>
-        <w:br/>
-      </w:r>
-      <w:r>
-        <w:rPr>
-          <w:rStyle w:val="NormalTok"/>
-        </w:rPr>
-        <w:t xml:space="preserve">  </w:t>
-      </w:r>
-      <w:r>
-        <w:rPr>
-          <w:rStyle w:val="FunctionTok"/>
-        </w:rPr>
-        <w:t>}</w:t>
-      </w:r>
-      <w:r>
-        <w:br/>
-      </w:r>
-      <w:r>
-        <w:rPr>
-          <w:rStyle w:val="FunctionTok"/>
-        </w:rPr>
-        <w:t>}</w:t>
-      </w:r>
-    </w:p>
-    <w:p>
-      <w:r>
-        <w:pict>
-          <v:rect id="_x0000_i1027" style="width:0;height:1.5pt" o:hralign="center" o:hrstd="t" o:hr="t"/>
-        </w:pict>
-      </w:r>
-    </w:p>
-    <w:p>
-      <w:pPr>
-        <w:pStyle w:val="Heading1"/>
-      </w:pPr>
       <w:bookmarkStart w:id="8" w:name="career"/>
       <w:bookmarkEnd w:id="4"/>
       <w:bookmarkEnd w:id="7"/>
       <w:r>
-        <w:t>💼</w:t>
-      </w:r>
-      <w:r>
-        <w:t xml:space="preserve"> CAREER</w:t>
+        <w:t>💼 CAREER</w:t>
       </w:r>
     </w:p>
     <w:p>
@@ -1198,13 +964,7 @@
         <w:rPr>
           <w:rStyle w:val="StringTok"/>
         </w:rPr>
-        <w:t>"</w:t>
-      </w:r>
-      <w:r>
-        <w:rPr>
-          <w:rStyle w:val="StringTok"/>
-        </w:rPr>
-        <w:t xml:space="preserve">Eyob is currently working as a </w:t>
+        <w:t xml:space="preserve">"Eyob is currently working as a </w:t>
       </w:r>
       <w:r>
         <w:rPr>
@@ -1287,7 +1047,7 @@
       <w:bookmarkEnd w:id="9"/>
       <w:r>
         <w:pict>
-          <v:rect id="_x0000_i1028" style="width:0;height:1.5pt" o:hralign="center" o:hrstd="t" o:hr="t"/>
+          <v:rect id="_x0000_i1027" style="width:0;height:1.5pt" o:hralign="center" o:hrstd="t" o:hr="t"/>
         </w:pict>
       </w:r>
     </w:p>
@@ -1299,10 +1059,7 @@
       <w:bookmarkEnd w:id="8"/>
       <w:bookmarkEnd w:id="10"/>
       <w:r>
-        <w:t>🚀</w:t>
-      </w:r>
-      <w:r>
-        <w:t xml:space="preserve"> PROJECTS (REAL PORTFOLIO SYSTEMS)</w:t>
+        <w:t>🚀 PROJECTS (REAL PORTFOLIO SYSTEMS)</w:t>
       </w:r>
     </w:p>
     <w:p>
@@ -1427,13 +1184,7 @@
         <w:rPr>
           <w:rStyle w:val="StringTok"/>
         </w:rPr>
-        <w:t>"</w:t>
-      </w:r>
-      <w:r>
-        <w:rPr>
-          <w:rStyle w:val="StringTok"/>
-        </w:rPr>
-        <w:t>A full-stack Task Management System built using Angular and Spring Boot with JWT authentication, role management, task assignment, and progress tracking using Oracle SQL."</w:t>
+        <w:t>"A full-stack Task Management System built using Angular and Spring Boot with JWT authentication, role management, task assignment, and progress tracking using Oracle SQL."</w:t>
       </w:r>
       <w:r>
         <w:rPr>
@@ -1487,7 +1238,6 @@
         <w:rPr>
           <w:rStyle w:val="NormalTok"/>
         </w:rPr>
-        <w:lastRenderedPageBreak/>
         <w:t xml:space="preserve">    </w:t>
       </w:r>
       <w:r>
@@ -1572,13 +1322,290 @@
         <w:rPr>
           <w:rStyle w:val="StringTok"/>
         </w:rPr>
-        <w:t>"OracleSQ</w:t>
-      </w:r>
-      <w:r>
-        <w:rPr>
-          <w:rStyle w:val="StringTok"/>
-        </w:rPr>
-        <w:t>L"</w:t>
+        <w:t>"OracleSQL"</w:t>
+      </w:r>
+      <w:r>
+        <w:rPr>
+          <w:rStyle w:val="OtherTok"/>
+        </w:rPr>
+        <w:t>]</w:t>
+      </w:r>
+      <w:r>
+        <w:br/>
+      </w:r>
+      <w:r>
+        <w:rPr>
+          <w:rStyle w:val="NormalTok"/>
+        </w:rPr>
+        <w:t xml:space="preserve">  </w:t>
+      </w:r>
+      <w:r>
+        <w:rPr>
+          <w:rStyle w:val="FunctionTok"/>
+        </w:rPr>
+        <w:t>}</w:t>
+      </w:r>
+      <w:r>
+        <w:br/>
+      </w:r>
+      <w:r>
+        <w:rPr>
+          <w:rStyle w:val="FunctionTok"/>
+        </w:rPr>
+        <w:t>}</w:t>
+      </w:r>
+    </w:p>
+    <w:p>
+      <w:r>
+        <w:pict>
+          <v:rect id="_x0000_i1028" style="width:0;height:1.5pt" o:hralign="center" o:hrstd="t" o:hr="t"/>
+        </w:pict>
+      </w:r>
+    </w:p>
+    <w:p>
+      <w:pPr>
+        <w:pStyle w:val="Heading2"/>
+      </w:pPr>
+      <w:bookmarkStart w:id="13" w:name="Xeb3c67d308ff1a53fc6510ffa86d8afdcc20081"/>
+      <w:bookmarkEnd w:id="12"/>
+      <w:r>
+        <w:t>Loss Event + Compliance Self-Assessment System</w:t>
+      </w:r>
+    </w:p>
+    <w:p>
+      <w:pPr>
+        <w:pStyle w:val="SourceCode"/>
+      </w:pPr>
+      <w:r>
+        <w:rPr>
+          <w:rStyle w:val="FunctionTok"/>
+        </w:rPr>
+        <w:t>{</w:t>
+      </w:r>
+      <w:r>
+        <w:br/>
+      </w:r>
+      <w:r>
+        <w:rPr>
+          <w:rStyle w:val="NormalTok"/>
+        </w:rPr>
+        <w:t xml:space="preserve">  </w:t>
+      </w:r>
+      <w:r>
+        <w:rPr>
+          <w:rStyle w:val="DataTypeTok"/>
+        </w:rPr>
+        <w:t>"id"</w:t>
+      </w:r>
+      <w:r>
+        <w:rPr>
+          <w:rStyle w:val="FunctionTok"/>
+        </w:rPr>
+        <w:t>:</w:t>
+      </w:r>
+      <w:r>
+        <w:rPr>
+          <w:rStyle w:val="NormalTok"/>
+        </w:rPr>
+        <w:t xml:space="preserve"> </w:t>
+      </w:r>
+      <w:r>
+        <w:rPr>
+          <w:rStyle w:val="StringTok"/>
+        </w:rPr>
+        <w:t>"loss_event_system"</w:t>
+      </w:r>
+      <w:r>
+        <w:rPr>
+          <w:rStyle w:val="FunctionTok"/>
+        </w:rPr>
+        <w:t>,</w:t>
+      </w:r>
+      <w:r>
+        <w:br/>
+      </w:r>
+      <w:r>
+        <w:rPr>
+          <w:rStyle w:val="NormalTok"/>
+        </w:rPr>
+        <w:t xml:space="preserve">  </w:t>
+      </w:r>
+      <w:r>
+        <w:rPr>
+          <w:rStyle w:val="DataTypeTok"/>
+        </w:rPr>
+        <w:t>"payload"</w:t>
+      </w:r>
+      <w:r>
+        <w:rPr>
+          <w:rStyle w:val="FunctionTok"/>
+        </w:rPr>
+        <w:t>:</w:t>
+      </w:r>
+      <w:r>
+        <w:rPr>
+          <w:rStyle w:val="NormalTok"/>
+        </w:rPr>
+        <w:t xml:space="preserve"> </w:t>
+      </w:r>
+      <w:r>
+        <w:rPr>
+          <w:rStyle w:val="FunctionTok"/>
+        </w:rPr>
+        <w:t>{</w:t>
+      </w:r>
+      <w:r>
+        <w:br/>
+      </w:r>
+      <w:r>
+        <w:rPr>
+          <w:rStyle w:val="NormalTok"/>
+        </w:rPr>
+        <w:t xml:space="preserve">    </w:t>
+      </w:r>
+      <w:r>
+        <w:rPr>
+          <w:rStyle w:val="DataTypeTok"/>
+        </w:rPr>
+        <w:t>"text"</w:t>
+      </w:r>
+      <w:r>
+        <w:rPr>
+          <w:rStyle w:val="FunctionTok"/>
+        </w:rPr>
+        <w:t>:</w:t>
+      </w:r>
+      <w:r>
+        <w:rPr>
+          <w:rStyle w:val="NormalTok"/>
+        </w:rPr>
+        <w:t xml:space="preserve"> </w:t>
+      </w:r>
+      <w:r>
+        <w:rPr>
+          <w:rStyle w:val="StringTok"/>
+        </w:rPr>
+        <w:t>"Enterprise system for Hibret Bank that captures loss events and supports compliance self-assessment, reporting, and monitoring using Angular, Spring Boot, and Oracle SQL."</w:t>
+      </w:r>
+      <w:r>
+        <w:rPr>
+          <w:rStyle w:val="FunctionTok"/>
+        </w:rPr>
+        <w:t>,</w:t>
+      </w:r>
+      <w:r>
+        <w:br/>
+      </w:r>
+      <w:r>
+        <w:rPr>
+          <w:rStyle w:val="NormalTok"/>
+        </w:rPr>
+        <w:t xml:space="preserve">    </w:t>
+      </w:r>
+      <w:r>
+        <w:rPr>
+          <w:rStyle w:val="DataTypeTok"/>
+        </w:rPr>
+        <w:t>"category"</w:t>
+      </w:r>
+      <w:r>
+        <w:rPr>
+          <w:rStyle w:val="FunctionTok"/>
+        </w:rPr>
+        <w:t>:</w:t>
+      </w:r>
+      <w:r>
+        <w:rPr>
+          <w:rStyle w:val="NormalTok"/>
+        </w:rPr>
+        <w:t xml:space="preserve"> </w:t>
+      </w:r>
+      <w:r>
+        <w:rPr>
+          <w:rStyle w:val="StringTok"/>
+        </w:rPr>
+        <w:t>"project"</w:t>
+      </w:r>
+      <w:r>
+        <w:rPr>
+          <w:rStyle w:val="FunctionTok"/>
+        </w:rPr>
+        <w:t>,</w:t>
+      </w:r>
+      <w:r>
+        <w:br/>
+      </w:r>
+      <w:r>
+        <w:rPr>
+          <w:rStyle w:val="NormalTok"/>
+        </w:rPr>
+        <w:t xml:space="preserve">    </w:t>
+      </w:r>
+      <w:r>
+        <w:rPr>
+          <w:rStyle w:val="DataTypeTok"/>
+        </w:rPr>
+        <w:t>"stack"</w:t>
+      </w:r>
+      <w:r>
+        <w:rPr>
+          <w:rStyle w:val="FunctionTok"/>
+        </w:rPr>
+        <w:t>:</w:t>
+      </w:r>
+      <w:r>
+        <w:rPr>
+          <w:rStyle w:val="NormalTok"/>
+        </w:rPr>
+        <w:t xml:space="preserve"> </w:t>
+      </w:r>
+      <w:r>
+        <w:rPr>
+          <w:rStyle w:val="OtherTok"/>
+        </w:rPr>
+        <w:t>[</w:t>
+      </w:r>
+      <w:r>
+        <w:rPr>
+          <w:rStyle w:val="StringTok"/>
+        </w:rPr>
+        <w:t>"Angular"</w:t>
+      </w:r>
+      <w:r>
+        <w:rPr>
+          <w:rStyle w:val="OtherTok"/>
+        </w:rPr>
+        <w:t>,</w:t>
+      </w:r>
+      <w:r>
+        <w:rPr>
+          <w:rStyle w:val="NormalTok"/>
+        </w:rPr>
+        <w:t xml:space="preserve"> </w:t>
+      </w:r>
+      <w:r>
+        <w:rPr>
+          <w:rStyle w:val="StringTok"/>
+        </w:rPr>
+        <w:t>"Spring Boot"</w:t>
+      </w:r>
+      <w:r>
+        <w:rPr>
+          <w:rStyle w:val="OtherTok"/>
+        </w:rPr>
+        <w:t>,</w:t>
+      </w:r>
+      <w:r>
+        <w:rPr>
+          <w:rStyle w:val="NormalTok"/>
+        </w:rPr>
+        <w:t xml:space="preserve"> </w:t>
+      </w:r>
+      <w:r>
+        <w:rPr>
+          <w:rStyle w:val="StringTok"/>
+        </w:rPr>
+        <w:t>"OracleSQL"</w:t>
       </w:r>
       <w:r>
         <w:rPr>
@@ -1622,10 +1649,11 @@
       <w:pPr>
         <w:pStyle w:val="Heading2"/>
       </w:pPr>
-      <w:bookmarkStart w:id="13" w:name="Xeb3c67d308ff1a53fc6510ffa86d8afdcc20081"/>
-      <w:bookmarkEnd w:id="12"/>
-      <w:r>
-        <w:t>Loss Event + Compliance Self-Assessment System</w:t>
+      <w:bookmarkStart w:id="14" w:name="fixed-asset-management-system-fams"/>
+      <w:bookmarkEnd w:id="13"/>
+      <w:r>
+        <w:lastRenderedPageBreak/>
+        <w:t>Fixed Asset Management System (FAMS)</w:t>
       </w:r>
     </w:p>
     <w:p>
@@ -1669,7 +1697,7 @@
         <w:rPr>
           <w:rStyle w:val="StringTok"/>
         </w:rPr>
-        <w:t>"loss_event_system"</w:t>
+        <w:t>"fams"</w:t>
       </w:r>
       <w:r>
         <w:rPr>
@@ -1741,13 +1769,7 @@
         <w:rPr>
           <w:rStyle w:val="StringTok"/>
         </w:rPr>
-        <w:t>"</w:t>
-      </w:r>
-      <w:r>
-        <w:rPr>
-          <w:rStyle w:val="StringTok"/>
-        </w:rPr>
-        <w:t>Enterprise system for Hibret Bank that captures loss events and supports compliance self-assessment, reporting, and monitoring using Angular, Spring Boot, and Oracle SQL."</w:t>
+        <w:t>"Fixed Asset Management System for Hibret Bank managing asset lifecycle including registration, assignment, transfer, depreciation, and disposal using Angular, Spring Boot, and Oracle SQL."</w:t>
       </w:r>
       <w:r>
         <w:rPr>
@@ -1911,10 +1933,10 @@
       <w:pPr>
         <w:pStyle w:val="Heading2"/>
       </w:pPr>
-      <w:bookmarkStart w:id="14" w:name="fixed-asset-management-system-fams"/>
-      <w:bookmarkEnd w:id="13"/>
-      <w:r>
-        <w:t>Fixed Asset Management System (FAMS)</w:t>
+      <w:bookmarkStart w:id="15" w:name="complaint-management-system"/>
+      <w:bookmarkEnd w:id="14"/>
+      <w:r>
+        <w:t>Complaint Management System</w:t>
       </w:r>
     </w:p>
     <w:p>
@@ -1958,7 +1980,7 @@
         <w:rPr>
           <w:rStyle w:val="StringTok"/>
         </w:rPr>
-        <w:t>"fams"</w:t>
+        <w:t>"complaint_system"</w:t>
       </w:r>
       <w:r>
         <w:rPr>
@@ -2030,13 +2052,7 @@
         <w:rPr>
           <w:rStyle w:val="StringTok"/>
         </w:rPr>
-        <w:t>"Fixed Asset Management System for Hibret Bank managing asset lifecycle including registration, assignment, transfer, depreciation, and disposal using Angular, Spring Bo</w:t>
-      </w:r>
-      <w:r>
-        <w:rPr>
-          <w:rStyle w:val="StringTok"/>
-        </w:rPr>
-        <w:t>ot, and Oracle SQL."</w:t>
+        <w:t>"Complaint Management System built for Assosa University using React, Node.js, Express, and MongoDB for complaint submission, tracking, and reporting."</w:t>
       </w:r>
       <w:r>
         <w:rPr>
@@ -2120,7 +2136,7 @@
         <w:rPr>
           <w:rStyle w:val="StringTok"/>
         </w:rPr>
-        <w:t>"Angular"</w:t>
+        <w:t>"React"</w:t>
       </w:r>
       <w:r>
         <w:rPr>
@@ -2138,7 +2154,7 @@
         <w:rPr>
           <w:rStyle w:val="StringTok"/>
         </w:rPr>
-        <w:t>"Spring Boot"</w:t>
+        <w:t>"Node.js"</w:t>
       </w:r>
       <w:r>
         <w:rPr>
@@ -2156,7 +2172,25 @@
         <w:rPr>
           <w:rStyle w:val="StringTok"/>
         </w:rPr>
-        <w:t>"OracleSQL"</w:t>
+        <w:t>"Express"</w:t>
+      </w:r>
+      <w:r>
+        <w:rPr>
+          <w:rStyle w:val="OtherTok"/>
+        </w:rPr>
+        <w:t>,</w:t>
+      </w:r>
+      <w:r>
+        <w:rPr>
+          <w:rStyle w:val="NormalTok"/>
+        </w:rPr>
+        <w:t xml:space="preserve"> </w:t>
+      </w:r>
+      <w:r>
+        <w:rPr>
+          <w:rStyle w:val="StringTok"/>
+        </w:rPr>
+        <w:t>"MongoDB"</w:t>
       </w:r>
       <w:r>
         <w:rPr>
@@ -2200,10 +2234,10 @@
       <w:pPr>
         <w:pStyle w:val="Heading2"/>
       </w:pPr>
-      <w:bookmarkStart w:id="15" w:name="complaint-management-system"/>
-      <w:bookmarkEnd w:id="14"/>
-      <w:r>
-        <w:t>Complaint Management System</w:t>
+      <w:bookmarkStart w:id="16" w:name="silehager-catering-website"/>
+      <w:bookmarkEnd w:id="15"/>
+      <w:r>
+        <w:t>Silehager Catering Website</w:t>
       </w:r>
     </w:p>
     <w:p>
@@ -2247,7 +2281,7 @@
         <w:rPr>
           <w:rStyle w:val="StringTok"/>
         </w:rPr>
-        <w:t>"complaint_system"</w:t>
+        <w:t>"catering_site"</w:t>
       </w:r>
       <w:r>
         <w:rPr>
@@ -2319,13 +2353,7 @@
         <w:rPr>
           <w:rStyle w:val="StringTok"/>
         </w:rPr>
-        <w:t>"Complaint Management System built for Assosa University usin</w:t>
-      </w:r>
-      <w:r>
-        <w:rPr>
-          <w:rStyle w:val="StringTok"/>
-        </w:rPr>
-        <w:t>g React, Node.js, Express, and MongoDB for complaint submission, tracking, and reporting."</w:t>
+        <w:t>"Silehager Catering website built with Angular and Tailwind CSS featuring service listings, menu display, booking system, and deployed on Vercel."</w:t>
       </w:r>
       <w:r>
         <w:rPr>
@@ -2409,7 +2437,7 @@
         <w:rPr>
           <w:rStyle w:val="StringTok"/>
         </w:rPr>
-        <w:t>"React"</w:t>
+        <w:t>"Angular"</w:t>
       </w:r>
       <w:r>
         <w:rPr>
@@ -2427,43 +2455,7 @@
         <w:rPr>
           <w:rStyle w:val="StringTok"/>
         </w:rPr>
-        <w:t>"Node.js"</w:t>
-      </w:r>
-      <w:r>
-        <w:rPr>
-          <w:rStyle w:val="OtherTok"/>
-        </w:rPr>
-        <w:t>,</w:t>
-      </w:r>
-      <w:r>
-        <w:rPr>
-          <w:rStyle w:val="NormalTok"/>
-        </w:rPr>
-        <w:t xml:space="preserve"> </w:t>
-      </w:r>
-      <w:r>
-        <w:rPr>
-          <w:rStyle w:val="StringTok"/>
-        </w:rPr>
-        <w:t>"Express"</w:t>
-      </w:r>
-      <w:r>
-        <w:rPr>
-          <w:rStyle w:val="OtherTok"/>
-        </w:rPr>
-        <w:t>,</w:t>
-      </w:r>
-      <w:r>
-        <w:rPr>
-          <w:rStyle w:val="NormalTok"/>
-        </w:rPr>
-        <w:t xml:space="preserve"> </w:t>
-      </w:r>
-      <w:r>
-        <w:rPr>
-          <w:rStyle w:val="StringTok"/>
-        </w:rPr>
-        <w:t>"MongoDB"</w:t>
+        <w:t>"Tailwind"</w:t>
       </w:r>
       <w:r>
         <w:rPr>
@@ -2502,278 +2494,10 @@
           <v:rect id="_x0000_i1032" style="width:0;height:1.5pt" o:hralign="center" o:hrstd="t" o:hr="t"/>
         </w:pict>
       </w:r>
-    </w:p>
-    <w:p>
-      <w:pPr>
-        <w:pStyle w:val="Heading2"/>
-      </w:pPr>
-      <w:bookmarkStart w:id="16" w:name="silehager-catering-website"/>
-      <w:bookmarkEnd w:id="15"/>
-      <w:r>
-        <w:lastRenderedPageBreak/>
-        <w:t>Silehager Catering Website</w:t>
-      </w:r>
-    </w:p>
-    <w:p>
-      <w:pPr>
-        <w:pStyle w:val="SourceCode"/>
-      </w:pPr>
-      <w:r>
-        <w:rPr>
-          <w:rStyle w:val="FunctionTok"/>
-        </w:rPr>
-        <w:t>{</w:t>
-      </w:r>
-      <w:r>
-        <w:br/>
-      </w:r>
-      <w:r>
-        <w:rPr>
-          <w:rStyle w:val="NormalTok"/>
-        </w:rPr>
-        <w:t xml:space="preserve">  </w:t>
-      </w:r>
-      <w:r>
-        <w:rPr>
-          <w:rStyle w:val="DataTypeTok"/>
-        </w:rPr>
-        <w:t>"id"</w:t>
-      </w:r>
-      <w:r>
-        <w:rPr>
-          <w:rStyle w:val="FunctionTok"/>
-        </w:rPr>
-        <w:t>:</w:t>
-      </w:r>
-      <w:r>
-        <w:rPr>
-          <w:rStyle w:val="NormalTok"/>
-        </w:rPr>
-        <w:t xml:space="preserve"> </w:t>
-      </w:r>
-      <w:r>
-        <w:rPr>
-          <w:rStyle w:val="StringTok"/>
-        </w:rPr>
-        <w:t>"catering_site"</w:t>
-      </w:r>
-      <w:r>
-        <w:rPr>
-          <w:rStyle w:val="FunctionTok"/>
-        </w:rPr>
-        <w:t>,</w:t>
-      </w:r>
-      <w:r>
-        <w:br/>
-      </w:r>
-      <w:r>
-        <w:rPr>
-          <w:rStyle w:val="NormalTok"/>
-        </w:rPr>
-        <w:t xml:space="preserve">  </w:t>
-      </w:r>
-      <w:r>
-        <w:rPr>
-          <w:rStyle w:val="DataTypeTok"/>
-        </w:rPr>
-        <w:t>"payload"</w:t>
-      </w:r>
-      <w:r>
-        <w:rPr>
-          <w:rStyle w:val="FunctionTok"/>
-        </w:rPr>
-        <w:t>:</w:t>
-      </w:r>
-      <w:r>
-        <w:rPr>
-          <w:rStyle w:val="NormalTok"/>
-        </w:rPr>
-        <w:t xml:space="preserve"> </w:t>
-      </w:r>
-      <w:r>
-        <w:rPr>
-          <w:rStyle w:val="FunctionTok"/>
-        </w:rPr>
-        <w:t>{</w:t>
-      </w:r>
-      <w:r>
-        <w:br/>
-      </w:r>
-      <w:r>
-        <w:rPr>
-          <w:rStyle w:val="NormalTok"/>
-        </w:rPr>
-        <w:t xml:space="preserve">    </w:t>
-      </w:r>
-      <w:r>
-        <w:rPr>
-          <w:rStyle w:val="DataTypeTok"/>
-        </w:rPr>
-        <w:t>"text"</w:t>
-      </w:r>
-      <w:r>
-        <w:rPr>
-          <w:rStyle w:val="FunctionTok"/>
-        </w:rPr>
-        <w:t>:</w:t>
-      </w:r>
-      <w:r>
-        <w:rPr>
-          <w:rStyle w:val="NormalTok"/>
-        </w:rPr>
-        <w:t xml:space="preserve"> </w:t>
-      </w:r>
-      <w:r>
-        <w:rPr>
-          <w:rStyle w:val="StringTok"/>
-        </w:rPr>
-        <w:t>"Silehager Catering website built with Angular and Tailwind CSS featuring service listings, menu display, booking system, and deployed on Vercel."</w:t>
-      </w:r>
-      <w:r>
-        <w:rPr>
-          <w:rStyle w:val="FunctionTok"/>
-        </w:rPr>
-        <w:t>,</w:t>
-      </w:r>
-      <w:r>
-        <w:br/>
-      </w:r>
-      <w:r>
-        <w:rPr>
-          <w:rStyle w:val="NormalTok"/>
-        </w:rPr>
-        <w:t xml:space="preserve">    </w:t>
-      </w:r>
-      <w:r>
-        <w:rPr>
-          <w:rStyle w:val="DataTypeTok"/>
-        </w:rPr>
-        <w:t>"category"</w:t>
-      </w:r>
-      <w:r>
-        <w:rPr>
-          <w:rStyle w:val="FunctionTok"/>
-        </w:rPr>
-        <w:t>:</w:t>
-      </w:r>
-      <w:r>
-        <w:rPr>
-          <w:rStyle w:val="NormalTok"/>
-        </w:rPr>
-        <w:t xml:space="preserve"> </w:t>
-      </w:r>
-      <w:r>
-        <w:rPr>
-          <w:rStyle w:val="StringTok"/>
-        </w:rPr>
-        <w:t>"project"</w:t>
-      </w:r>
-      <w:r>
-        <w:rPr>
-          <w:rStyle w:val="FunctionTok"/>
-        </w:rPr>
-        <w:t>,</w:t>
-      </w:r>
-      <w:r>
-        <w:br/>
-      </w:r>
-      <w:r>
-        <w:rPr>
-          <w:rStyle w:val="NormalTok"/>
-        </w:rPr>
-        <w:t xml:space="preserve">    </w:t>
-      </w:r>
-      <w:r>
-        <w:rPr>
-          <w:rStyle w:val="DataTypeTok"/>
-        </w:rPr>
-        <w:t>"stack"</w:t>
-      </w:r>
-      <w:r>
-        <w:rPr>
-          <w:rStyle w:val="FunctionTok"/>
-        </w:rPr>
-        <w:t>:</w:t>
-      </w:r>
-      <w:r>
-        <w:rPr>
-          <w:rStyle w:val="NormalTok"/>
-        </w:rPr>
-        <w:t xml:space="preserve"> </w:t>
-      </w:r>
-      <w:r>
-        <w:rPr>
-          <w:rStyle w:val="OtherTok"/>
-        </w:rPr>
-        <w:t>[</w:t>
-      </w:r>
-      <w:r>
-        <w:rPr>
-          <w:rStyle w:val="StringTok"/>
-        </w:rPr>
-        <w:t>"Angular"</w:t>
-      </w:r>
-      <w:r>
-        <w:rPr>
-          <w:rStyle w:val="OtherTok"/>
-        </w:rPr>
-        <w:t>,</w:t>
-      </w:r>
-      <w:r>
-        <w:rPr>
-          <w:rStyle w:val="NormalTok"/>
-        </w:rPr>
-        <w:t xml:space="preserve"> </w:t>
-      </w:r>
-      <w:r>
-        <w:rPr>
-          <w:rStyle w:val="StringTok"/>
-        </w:rPr>
-        <w:t>"Tailwind"</w:t>
-      </w:r>
-      <w:r>
-        <w:rPr>
-          <w:rStyle w:val="OtherTok"/>
-        </w:rPr>
-        <w:t>]</w:t>
-      </w:r>
-      <w:r>
-        <w:br/>
-      </w:r>
-      <w:r>
-        <w:rPr>
-          <w:rStyle w:val="NormalTok"/>
-        </w:rPr>
-        <w:t xml:space="preserve">  </w:t>
-      </w:r>
-      <w:r>
-        <w:rPr>
-          <w:rStyle w:val="FunctionTok"/>
-        </w:rPr>
-        <w:t>}</w:t>
-      </w:r>
-      <w:r>
-        <w:br/>
-      </w:r>
-      <w:r>
-        <w:rPr>
-          <w:rStyle w:val="FunctionTok"/>
-        </w:rPr>
-        <w:t>}</w:t>
-      </w:r>
-    </w:p>
-    <w:p>
-      <w:r>
-        <w:pict>
-          <v:rect id="_x0000_i1033" style="width:0;height:1.5pt" o:hralign="center" o:hrstd="t" o:hr="t"/>
-        </w:pict>
-      </w:r>
       <w:bookmarkStart w:id="17" w:name="result"/>
-      <w:bookmarkStart w:id="18" w:name="_GoBack"/>
       <w:bookmarkEnd w:id="11"/>
       <w:bookmarkEnd w:id="16"/>
       <w:bookmarkEnd w:id="17"/>
-      <w:bookmarkEnd w:id="18"/>
     </w:p>
     <w:sectPr>
       <w:footnotePr>
@@ -4445,7 +4169,7 @@
 </file>
 
 <file path=customXml/itemProps1.xml><?xml version="1.0" encoding="utf-8"?>
-<ds:datastoreItem xmlns:ds="http://schemas.openxmlformats.org/officeDocument/2006/customXml" ds:itemID="{D3F8086A-1B3D-47B8-8683-B24E114705D2}">
+<ds:datastoreItem xmlns:ds="http://schemas.openxmlformats.org/officeDocument/2006/customXml" ds:itemID="{D80FEBA4-1E85-4BE4-897E-F4FF4AC3B1E5}">
   <ds:schemaRefs>
     <ds:schemaRef ds:uri="http://schemas.openxmlformats.org/officeDocument/2006/bibliography"/>
   </ds:schemaRefs>

</xml_diff>

<commit_message>
feat: implement RAG pipeline with FastAPI, Qdrant integration, and multi-provider embedding support
</commit_message>
<xml_diff>
--- a/data/rag_file.docx
+++ b/data/rag_file.docx
@@ -1,6 +1,6 @@
 
 <file path=word/document.xml><?xml version="1.0" encoding="utf-8"?>
-<w:document xmlns:wpc="http://schemas.microsoft.com/office/word/2010/wordprocessingCanvas" xmlns:cx="http://schemas.microsoft.com/office/drawing/2014/chartex" xmlns:cx1="http://schemas.microsoft.com/office/drawing/2015/9/8/chartex" xmlns:mc="http://schemas.openxmlformats.org/markup-compatibility/2006" xmlns:o="urn:schemas-microsoft-com:office:office" xmlns:r="http://schemas.openxmlformats.org/officeDocument/2006/relationships" xmlns:m="http://schemas.openxmlformats.org/officeDocument/2006/math" xmlns:v="urn:schemas-microsoft-com:vml" xmlns:wp14="http://schemas.microsoft.com/office/word/2010/wordprocessingDrawing" xmlns:wp="http://schemas.openxmlformats.org/drawingml/2006/wordprocessingDrawing" xmlns:w10="urn:schemas-microsoft-com:office:word" xmlns:w="http://schemas.openxmlformats.org/wordprocessingml/2006/main" xmlns:w14="http://schemas.microsoft.com/office/word/2010/wordml" xmlns:w15="http://schemas.microsoft.com/office/word/2012/wordml" xmlns:w16se="http://schemas.microsoft.com/office/word/2015/wordml/symex" xmlns:wpg="http://schemas.microsoft.com/office/word/2010/wordprocessingGroup" xmlns:wpi="http://schemas.microsoft.com/office/word/2010/wordprocessingInk" xmlns:wne="http://schemas.microsoft.com/office/word/2006/wordml" xmlns:wps="http://schemas.microsoft.com/office/word/2010/wordprocessingShape" mc:Ignorable="w14 w15 w16se wp14">
+<w:document xmlns:wpc="http://schemas.microsoft.com/office/word/2010/wordprocessingCanvas" xmlns:mc="http://schemas.openxmlformats.org/markup-compatibility/2006" xmlns:o="urn:schemas-microsoft-com:office:office" xmlns:r="http://schemas.openxmlformats.org/officeDocument/2006/relationships" xmlns:m="http://schemas.openxmlformats.org/officeDocument/2006/math" xmlns:v="urn:schemas-microsoft-com:vml" xmlns:wp14="http://schemas.microsoft.com/office/word/2010/wordprocessingDrawing" xmlns:wp="http://schemas.openxmlformats.org/drawingml/2006/wordprocessingDrawing" xmlns:w10="urn:schemas-microsoft-com:office:word" xmlns:w="http://schemas.openxmlformats.org/wordprocessingml/2006/main" xmlns:w14="http://schemas.microsoft.com/office/word/2010/wordml" xmlns:wpg="http://schemas.microsoft.com/office/word/2010/wordprocessingGroup" xmlns:wpi="http://schemas.microsoft.com/office/word/2010/wordprocessingInk" xmlns:wne="http://schemas.microsoft.com/office/word/2006/wordml" xmlns:wps="http://schemas.microsoft.com/office/word/2010/wordprocessingShape" mc:Ignorable="w14 wp14">
   <w:body>
     <w:p>
       <w:pPr>
@@ -17,8 +17,6 @@
       <w:r>
         <w:t xml:space="preserve"> PROFILE</w:t>
       </w:r>
-      <w:bookmarkStart w:id="1" w:name="_GoBack"/>
-      <w:bookmarkEnd w:id="1"/>
     </w:p>
     <w:p>
       <w:pPr>
@@ -36,15 +34,21 @@
         <w:pStyle w:val="NormalWeb"/>
       </w:pPr>
       <w:r>
-        <w:t xml:space="preserve">Eyob Hailu is a highly motivated Software Developer with a Bachelor of Science in Computer Science, graduating with a CGPA of 3.80 (Great Distinction). He combines strong academic performance with hands-on industry experience at </w:t>
+        <w:t>Eyob Hailu is a highly motivated Software Developer with a Bachelor of Science in Computer Science, graduating with a CGPA of 3.80 (Great Distinction)</w:t>
+      </w:r>
+      <w:r>
+        <w:t xml:space="preserve"> from </w:t>
       </w:r>
       <w:proofErr w:type="spellStart"/>
       <w:r>
-        <w:t>Hibret</w:t>
+        <w:t>Assosa</w:t>
       </w:r>
       <w:proofErr w:type="spellEnd"/>
       <w:r>
-        <w:t xml:space="preserve"> Bank, where he builds scalable enterprise systems.</w:t>
+        <w:t xml:space="preserve"> University</w:t>
+      </w:r>
+      <w:r>
+        <w:t>. He combines strong academic performance with hands-on industry experience at Hibret Bank, where he builds scalable enterprise systems.</w:t>
       </w:r>
     </w:p>
     <w:p>
@@ -66,7 +70,7 @@
     <w:p>
       <w:r>
         <w:pict>
-          <v:rect id="_x0000_i1041" style="width:0;height:1.5pt" o:hralign="center" o:hrstd="t" o:hr="t" fillcolor="#a0a0a0" stroked="f"/>
+          <v:rect id="_x0000_i1025" style="width:0;height:1.5pt" o:hralign="center" o:hrstd="t" o:hr="t" fillcolor="#a0a0a0" stroked="f"/>
         </w:pict>
       </w:r>
     </w:p>
@@ -155,7 +159,7 @@
     <w:p>
       <w:r>
         <w:pict>
-          <v:rect id="_x0000_i1042" style="width:0;height:1.5pt" o:hralign="center" o:hrstd="t" o:hr="t" fillcolor="#a0a0a0" stroked="f"/>
+          <v:rect id="_x0000_i1026" style="width:0;height:1.5pt" o:hralign="center" o:hrstd="t" o:hr="t" fillcolor="#a0a0a0" stroked="f"/>
         </w:pict>
       </w:r>
     </w:p>
@@ -301,7 +305,7 @@
       </w:pPr>
       <w:r>
         <w:pict>
-          <v:rect id="_x0000_i1043" style="width:0;height:1.5pt" o:hralign="center" o:hrstd="t" o:hr="t" fillcolor="#a0a0a0" stroked="f"/>
+          <v:rect id="_x0000_i1027" style="width:0;height:1.5pt" o:hralign="center" o:hrstd="t" o:hr="t" fillcolor="#a0a0a0" stroked="f"/>
         </w:pict>
       </w:r>
     </w:p>
@@ -411,7 +415,7 @@
       </w:pPr>
       <w:r>
         <w:pict>
-          <v:rect id="_x0000_i1044" style="width:0;height:1.5pt" o:hralign="center" o:hrstd="t" o:hr="t" fillcolor="#a0a0a0" stroked="f"/>
+          <v:rect id="_x0000_i1028" style="width:0;height:1.5pt" o:hralign="center" o:hrstd="t" o:hr="t" fillcolor="#a0a0a0" stroked="f"/>
         </w:pict>
       </w:r>
     </w:p>
@@ -434,15 +438,7 @@
         <w:pStyle w:val="Heading3"/>
       </w:pPr>
       <w:r>
-        <w:t xml:space="preserve">Software Developer – </w:t>
-      </w:r>
-      <w:proofErr w:type="spellStart"/>
-      <w:r>
-        <w:t>Hibret</w:t>
-      </w:r>
-      <w:proofErr w:type="spellEnd"/>
-      <w:r>
-        <w:t xml:space="preserve"> Bank</w:t>
+        <w:t>Software Developer – Hibret Bank</w:t>
       </w:r>
     </w:p>
     <w:p>
@@ -450,21 +446,13 @@
         <w:pStyle w:val="NormalWeb"/>
       </w:pPr>
       <w:r>
-        <w:t xml:space="preserve">Eyob currently works as a Software Developer at </w:t>
-      </w:r>
-      <w:proofErr w:type="spellStart"/>
-      <w:r>
-        <w:t>Hibret</w:t>
-      </w:r>
-      <w:proofErr w:type="spellEnd"/>
-      <w:r>
-        <w:t xml:space="preserve"> Bank, contributing to enterprise-grade financial systems. His work involves building secure, scalable applications that support critical banking operations, compliance, and reporting.</w:t>
+        <w:t>Eyob currently works as a Software Developer at Hibret Bank, contributing to enterprise-grade financial systems. His work involves building secure, scalable applications that support critical banking operations, compliance, and reporting.</w:t>
       </w:r>
     </w:p>
     <w:p>
       <w:r>
         <w:pict>
-          <v:rect id="_x0000_i1045" style="width:0;height:1.5pt" o:hralign="center" o:hrstd="t" o:hr="t" fillcolor="#a0a0a0" stroked="f"/>
+          <v:rect id="_x0000_i1029" style="width:0;height:1.5pt" o:hralign="center" o:hrstd="t" o:hr="t" fillcolor="#a0a0a0" stroked="f"/>
         </w:pict>
       </w:r>
     </w:p>
@@ -574,7 +562,7 @@
     <w:p>
       <w:r>
         <w:pict>
-          <v:rect id="_x0000_i1046" style="width:0;height:1.5pt" o:hralign="center" o:hrstd="t" o:hr="t" fillcolor="#a0a0a0" stroked="f"/>
+          <v:rect id="_x0000_i1030" style="width:0;height:1.5pt" o:hralign="center" o:hrstd="t" o:hr="t" fillcolor="#a0a0a0" stroked="f"/>
         </w:pict>
       </w:r>
     </w:p>
@@ -592,15 +580,7 @@
         <w:pStyle w:val="NormalWeb"/>
       </w:pPr>
       <w:r>
-        <w:t xml:space="preserve">A critical enterprise system developed for </w:t>
-      </w:r>
-      <w:proofErr w:type="spellStart"/>
-      <w:r>
-        <w:t>Hibret</w:t>
-      </w:r>
-      <w:proofErr w:type="spellEnd"/>
-      <w:r>
-        <w:t xml:space="preserve"> Bank.</w:t>
+        <w:t>A critical enterprise system developed for Hibret Bank.</w:t>
       </w:r>
     </w:p>
     <w:p>
@@ -667,7 +647,7 @@
     <w:p>
       <w:r>
         <w:pict>
-          <v:rect id="_x0000_i1047" style="width:0;height:1.5pt" o:hralign="center" o:hrstd="t" o:hr="t" fillcolor="#a0a0a0" stroked="f"/>
+          <v:rect id="_x0000_i1031" style="width:0;height:1.5pt" o:hralign="center" o:hrstd="t" o:hr="t" fillcolor="#a0a0a0" stroked="f"/>
         </w:pict>
       </w:r>
     </w:p>
@@ -683,17 +663,11 @@
       <w:pPr>
         <w:pStyle w:val="NormalWeb"/>
       </w:pPr>
-      <w:r>
-        <w:t xml:space="preserve">A complete </w:t>
-      </w:r>
       <w:proofErr w:type="gramStart"/>
       <w:r>
-        <w:t>asset lifecycle management system</w:t>
+        <w:t>A complete asset lifecycle management system.</w:t>
       </w:r>
       <w:proofErr w:type="gramEnd"/>
-      <w:r>
-        <w:t>.</w:t>
-      </w:r>
     </w:p>
     <w:p>
       <w:pPr>
@@ -759,7 +733,7 @@
     <w:p>
       <w:r>
         <w:pict>
-          <v:rect id="_x0000_i1048" style="width:0;height:1.5pt" o:hralign="center" o:hrstd="t" o:hr="t" fillcolor="#a0a0a0" stroked="f"/>
+          <v:rect id="_x0000_i1032" style="width:0;height:1.5pt" o:hralign="center" o:hrstd="t" o:hr="t" fillcolor="#a0a0a0" stroked="f"/>
         </w:pict>
       </w:r>
     </w:p>
@@ -851,7 +825,7 @@
     <w:p>
       <w:r>
         <w:pict>
-          <v:rect id="_x0000_i1049" style="width:0;height:1.5pt" o:hralign="center" o:hrstd="t" o:hr="t" fillcolor="#a0a0a0" stroked="f"/>
+          <v:rect id="_x0000_i1033" style="width:0;height:1.5pt" o:hralign="center" o:hrstd="t" o:hr="t" fillcolor="#a0a0a0" stroked="f"/>
         </w:pict>
       </w:r>
     </w:p>
@@ -960,6 +934,29 @@
       <w:r>
         <w:t xml:space="preserve"> Demonstrates frontend design skills and deployment experience.</w:t>
       </w:r>
+    </w:p>
+    <w:p>
+      <w:pPr>
+        <w:pStyle w:val="NormalWeb"/>
+      </w:pPr>
+    </w:p>
+    <w:p>
+      <w:pPr>
+        <w:pStyle w:val="NormalWeb"/>
+      </w:pPr>
+      <w:r>
+        <w:t>Contact:</w:t>
+      </w:r>
+      <w:r>
+        <w:br/>
+        <w:t>Email: eyobajobi@gmail.com</w:t>
+      </w:r>
+      <w:r>
+        <w:br/>
+        <w:t>Phone: +251975574718</w:t>
+      </w:r>
+      <w:bookmarkStart w:id="1" w:name="_GoBack"/>
+      <w:bookmarkEnd w:id="1"/>
     </w:p>
     <w:p/>
     <w:sectPr>
@@ -975,8 +972,8 @@
 </file>
 
 <file path=word/numbering.xml><?xml version="1.0" encoding="utf-8"?>
-<w:numbering xmlns:wpc="http://schemas.microsoft.com/office/word/2010/wordprocessingCanvas" xmlns:cx="http://schemas.microsoft.com/office/drawing/2014/chartex" xmlns:cx1="http://schemas.microsoft.com/office/drawing/2015/9/8/chartex" xmlns:mc="http://schemas.openxmlformats.org/markup-compatibility/2006" xmlns:o="urn:schemas-microsoft-com:office:office" xmlns:r="http://schemas.openxmlformats.org/officeDocument/2006/relationships" xmlns:m="http://schemas.openxmlformats.org/officeDocument/2006/math" xmlns:v="urn:schemas-microsoft-com:vml" xmlns:wp14="http://schemas.microsoft.com/office/word/2010/wordprocessingDrawing" xmlns:wp="http://schemas.openxmlformats.org/drawingml/2006/wordprocessingDrawing" xmlns:w10="urn:schemas-microsoft-com:office:word" xmlns:w="http://schemas.openxmlformats.org/wordprocessingml/2006/main" xmlns:w14="http://schemas.microsoft.com/office/word/2010/wordml" xmlns:w15="http://schemas.microsoft.com/office/word/2012/wordml" xmlns:w16se="http://schemas.microsoft.com/office/word/2015/wordml/symex" xmlns:wpg="http://schemas.microsoft.com/office/word/2010/wordprocessingGroup" xmlns:wpi="http://schemas.microsoft.com/office/word/2010/wordprocessingInk" xmlns:wne="http://schemas.microsoft.com/office/word/2006/wordml" xmlns:wps="http://schemas.microsoft.com/office/word/2010/wordprocessingShape" mc:Ignorable="w14 w15 w16se wp14">
-  <w:abstractNum w:abstractNumId="0" w15:restartNumberingAfterBreak="0">
+<w:numbering xmlns:wpc="http://schemas.microsoft.com/office/word/2010/wordprocessingCanvas" xmlns:mc="http://schemas.openxmlformats.org/markup-compatibility/2006" xmlns:o="urn:schemas-microsoft-com:office:office" xmlns:r="http://schemas.openxmlformats.org/officeDocument/2006/relationships" xmlns:m="http://schemas.openxmlformats.org/officeDocument/2006/math" xmlns:v="urn:schemas-microsoft-com:vml" xmlns:wp14="http://schemas.microsoft.com/office/word/2010/wordprocessingDrawing" xmlns:wp="http://schemas.openxmlformats.org/drawingml/2006/wordprocessingDrawing" xmlns:w10="urn:schemas-microsoft-com:office:word" xmlns:w="http://schemas.openxmlformats.org/wordprocessingml/2006/main" xmlns:w14="http://schemas.microsoft.com/office/word/2010/wordml" xmlns:wpg="http://schemas.microsoft.com/office/word/2010/wordprocessingGroup" xmlns:wpi="http://schemas.microsoft.com/office/word/2010/wordprocessingInk" xmlns:wne="http://schemas.microsoft.com/office/word/2006/wordml" xmlns:wps="http://schemas.microsoft.com/office/word/2010/wordprocessingShape" mc:Ignorable="w14 wp14">
+  <w:abstractNum w:abstractNumId="0">
     <w:nsid w:val="0000A990"/>
     <w:multiLevelType w:val="multilevel"/>
     <w:tmpl w:val="74DA4D76"/>
@@ -1053,7 +1050,7 @@
       </w:pPr>
     </w:lvl>
   </w:abstractNum>
-  <w:abstractNum w:abstractNumId="1" w15:restartNumberingAfterBreak="0">
+  <w:abstractNum w:abstractNumId="1">
     <w:nsid w:val="0000A991"/>
     <w:multiLevelType w:val="multilevel"/>
     <w:tmpl w:val="05F8401A"/>
@@ -1157,7 +1154,7 @@
       </w:rPr>
     </w:lvl>
   </w:abstractNum>
-  <w:abstractNum w:abstractNumId="2" w15:restartNumberingAfterBreak="0">
+  <w:abstractNum w:abstractNumId="2">
     <w:nsid w:val="12D22B6A"/>
     <w:multiLevelType w:val="multilevel"/>
     <w:tmpl w:val="94A2A424"/>
@@ -1306,7 +1303,7 @@
       </w:rPr>
     </w:lvl>
   </w:abstractNum>
-  <w:abstractNum w:abstractNumId="3" w15:restartNumberingAfterBreak="0">
+  <w:abstractNum w:abstractNumId="3">
     <w:nsid w:val="2CDD548A"/>
     <w:multiLevelType w:val="multilevel"/>
     <w:tmpl w:val="D73EE7C8"/>
@@ -1455,7 +1452,7 @@
       </w:rPr>
     </w:lvl>
   </w:abstractNum>
-  <w:abstractNum w:abstractNumId="4" w15:restartNumberingAfterBreak="0">
+  <w:abstractNum w:abstractNumId="4">
     <w:nsid w:val="3966507F"/>
     <w:multiLevelType w:val="multilevel"/>
     <w:tmpl w:val="A30A43C6"/>
@@ -1604,7 +1601,7 @@
       </w:rPr>
     </w:lvl>
   </w:abstractNum>
-  <w:abstractNum w:abstractNumId="5" w15:restartNumberingAfterBreak="0">
+  <w:abstractNum w:abstractNumId="5">
     <w:nsid w:val="45852FD7"/>
     <w:multiLevelType w:val="multilevel"/>
     <w:tmpl w:val="2DA69F80"/>
@@ -1753,7 +1750,7 @@
       </w:rPr>
     </w:lvl>
   </w:abstractNum>
-  <w:abstractNum w:abstractNumId="6" w15:restartNumberingAfterBreak="0">
+  <w:abstractNum w:abstractNumId="6">
     <w:nsid w:val="46864437"/>
     <w:multiLevelType w:val="multilevel"/>
     <w:tmpl w:val="64428FAC"/>
@@ -1902,7 +1899,7 @@
       </w:rPr>
     </w:lvl>
   </w:abstractNum>
-  <w:abstractNum w:abstractNumId="7" w15:restartNumberingAfterBreak="0">
+  <w:abstractNum w:abstractNumId="7">
     <w:nsid w:val="487610BE"/>
     <w:multiLevelType w:val="multilevel"/>
     <w:tmpl w:val="0C16F1B0"/>
@@ -2051,7 +2048,7 @@
       </w:rPr>
     </w:lvl>
   </w:abstractNum>
-  <w:abstractNum w:abstractNumId="8" w15:restartNumberingAfterBreak="0">
+  <w:abstractNum w:abstractNumId="8">
     <w:nsid w:val="49114545"/>
     <w:multiLevelType w:val="multilevel"/>
     <w:tmpl w:val="344E14E4"/>
@@ -2200,7 +2197,7 @@
       </w:rPr>
     </w:lvl>
   </w:abstractNum>
-  <w:abstractNum w:abstractNumId="9" w15:restartNumberingAfterBreak="0">
+  <w:abstractNum w:abstractNumId="9">
     <w:nsid w:val="4CA806D5"/>
     <w:multiLevelType w:val="multilevel"/>
     <w:tmpl w:val="9574EB82"/>
@@ -2349,7 +2346,7 @@
       </w:rPr>
     </w:lvl>
   </w:abstractNum>
-  <w:abstractNum w:abstractNumId="10" w15:restartNumberingAfterBreak="0">
+  <w:abstractNum w:abstractNumId="10">
     <w:nsid w:val="57035620"/>
     <w:multiLevelType w:val="multilevel"/>
     <w:tmpl w:val="C8563022"/>
@@ -2541,7 +2538,7 @@
 </file>
 
 <file path=word/styles.xml><?xml version="1.0" encoding="utf-8"?>
-<w:styles xmlns:mc="http://schemas.openxmlformats.org/markup-compatibility/2006" xmlns:r="http://schemas.openxmlformats.org/officeDocument/2006/relationships" xmlns:w="http://schemas.openxmlformats.org/wordprocessingml/2006/main" xmlns:w14="http://schemas.microsoft.com/office/word/2010/wordml" xmlns:w15="http://schemas.microsoft.com/office/word/2012/wordml" xmlns:w16se="http://schemas.microsoft.com/office/word/2015/wordml/symex" mc:Ignorable="w14 w15 w16se">
+<w:styles xmlns:mc="http://schemas.openxmlformats.org/markup-compatibility/2006" xmlns:r="http://schemas.openxmlformats.org/officeDocument/2006/relationships" xmlns:w="http://schemas.openxmlformats.org/wordprocessingml/2006/main" xmlns:w14="http://schemas.microsoft.com/office/word/2010/wordml" mc:Ignorable="w14">
   <w:docDefaults>
     <w:rPrDefault>
       <w:rPr>
@@ -2557,346 +2554,135 @@
       </w:pPr>
     </w:pPrDefault>
   </w:docDefaults>
-  <w:latentStyles w:defLockedState="0" w:defUIPriority="0" w:defSemiHidden="0" w:defUnhideWhenUsed="0" w:defQFormat="0" w:count="371">
-    <w:lsdException w:name="heading 7" w:semiHidden="1" w:unhideWhenUsed="1"/>
-    <w:lsdException w:name="heading 8" w:semiHidden="1" w:unhideWhenUsed="1"/>
-    <w:lsdException w:name="heading 9" w:semiHidden="1" w:unhideWhenUsed="1"/>
-    <w:lsdException w:name="index 1" w:semiHidden="1" w:unhideWhenUsed="1"/>
-    <w:lsdException w:name="index 2" w:semiHidden="1" w:unhideWhenUsed="1"/>
-    <w:lsdException w:name="index 3" w:semiHidden="1" w:unhideWhenUsed="1"/>
-    <w:lsdException w:name="index 4" w:semiHidden="1" w:unhideWhenUsed="1"/>
-    <w:lsdException w:name="index 5" w:semiHidden="1" w:unhideWhenUsed="1"/>
-    <w:lsdException w:name="index 6" w:semiHidden="1" w:unhideWhenUsed="1"/>
-    <w:lsdException w:name="index 7" w:semiHidden="1" w:unhideWhenUsed="1"/>
-    <w:lsdException w:name="index 8" w:semiHidden="1" w:unhideWhenUsed="1"/>
-    <w:lsdException w:name="index 9" w:semiHidden="1" w:unhideWhenUsed="1"/>
-    <w:lsdException w:name="toc 1" w:semiHidden="1" w:unhideWhenUsed="1"/>
-    <w:lsdException w:name="toc 2" w:semiHidden="1" w:unhideWhenUsed="1"/>
-    <w:lsdException w:name="toc 3" w:semiHidden="1" w:unhideWhenUsed="1"/>
-    <w:lsdException w:name="toc 4" w:semiHidden="1" w:unhideWhenUsed="1"/>
-    <w:lsdException w:name="toc 5" w:semiHidden="1" w:unhideWhenUsed="1"/>
-    <w:lsdException w:name="toc 6" w:semiHidden="1" w:unhideWhenUsed="1"/>
-    <w:lsdException w:name="toc 7" w:semiHidden="1" w:unhideWhenUsed="1"/>
-    <w:lsdException w:name="toc 8" w:semiHidden="1" w:unhideWhenUsed="1"/>
-    <w:lsdException w:name="toc 9" w:semiHidden="1" w:unhideWhenUsed="1"/>
-    <w:lsdException w:name="Normal Indent" w:semiHidden="1" w:unhideWhenUsed="1"/>
-    <w:lsdException w:name="footnote text" w:semiHidden="1" w:unhideWhenUsed="1"/>
-    <w:lsdException w:name="annotation text" w:semiHidden="1" w:unhideWhenUsed="1"/>
-    <w:lsdException w:name="header" w:semiHidden="1" w:unhideWhenUsed="1"/>
-    <w:lsdException w:name="footer" w:semiHidden="1" w:unhideWhenUsed="1"/>
-    <w:lsdException w:name="index heading" w:semiHidden="1" w:unhideWhenUsed="1"/>
-    <w:lsdException w:name="caption" w:semiHidden="1" w:unhideWhenUsed="1"/>
-    <w:lsdException w:name="table of figures" w:semiHidden="1" w:unhideWhenUsed="1"/>
-    <w:lsdException w:name="envelope address" w:semiHidden="1" w:unhideWhenUsed="1"/>
-    <w:lsdException w:name="envelope return" w:semiHidden="1" w:unhideWhenUsed="1"/>
-    <w:lsdException w:name="footnote reference" w:semiHidden="1" w:unhideWhenUsed="1"/>
-    <w:lsdException w:name="annotation reference" w:semiHidden="1" w:unhideWhenUsed="1"/>
-    <w:lsdException w:name="line number" w:semiHidden="1" w:unhideWhenUsed="1"/>
-    <w:lsdException w:name="page number" w:semiHidden="1" w:unhideWhenUsed="1"/>
-    <w:lsdException w:name="endnote reference" w:semiHidden="1" w:unhideWhenUsed="1"/>
-    <w:lsdException w:name="endnote text" w:semiHidden="1" w:unhideWhenUsed="1"/>
-    <w:lsdException w:name="table of authorities" w:semiHidden="1" w:unhideWhenUsed="1"/>
-    <w:lsdException w:name="macro" w:semiHidden="1" w:unhideWhenUsed="1"/>
-    <w:lsdException w:name="toa heading" w:semiHidden="1" w:unhideWhenUsed="1"/>
-    <w:lsdException w:name="List" w:semiHidden="1" w:unhideWhenUsed="1"/>
-    <w:lsdException w:name="List Bullet" w:semiHidden="1" w:unhideWhenUsed="1"/>
-    <w:lsdException w:name="List 2" w:semiHidden="1" w:unhideWhenUsed="1"/>
-    <w:lsdException w:name="List 3" w:semiHidden="1" w:unhideWhenUsed="1"/>
-    <w:lsdException w:name="List Bullet 2" w:semiHidden="1" w:unhideWhenUsed="1"/>
-    <w:lsdException w:name="List Bullet 3" w:semiHidden="1" w:unhideWhenUsed="1"/>
-    <w:lsdException w:name="List Bullet 4" w:semiHidden="1" w:unhideWhenUsed="1"/>
-    <w:lsdException w:name="List Bullet 5" w:semiHidden="1" w:unhideWhenUsed="1"/>
-    <w:lsdException w:name="List Number 2" w:semiHidden="1" w:unhideWhenUsed="1"/>
-    <w:lsdException w:name="List Number 3" w:semiHidden="1" w:unhideWhenUsed="1"/>
-    <w:lsdException w:name="List Number 4" w:semiHidden="1" w:unhideWhenUsed="1"/>
-    <w:lsdException w:name="List Number 5" w:semiHidden="1" w:unhideWhenUsed="1"/>
-    <w:lsdException w:name="Closing" w:semiHidden="1" w:unhideWhenUsed="1"/>
-    <w:lsdException w:name="Signature" w:semiHidden="1" w:unhideWhenUsed="1"/>
-    <w:lsdException w:name="Default Paragraph Font" w:semiHidden="1" w:unhideWhenUsed="1"/>
-    <w:lsdException w:name="Body Text" w:semiHidden="1" w:unhideWhenUsed="1"/>
-    <w:lsdException w:name="Body Text Indent" w:semiHidden="1" w:unhideWhenUsed="1"/>
-    <w:lsdException w:name="List Continue" w:semiHidden="1" w:unhideWhenUsed="1"/>
-    <w:lsdException w:name="List Continue 2" w:semiHidden="1" w:unhideWhenUsed="1"/>
-    <w:lsdException w:name="List Continue 3" w:semiHidden="1" w:unhideWhenUsed="1"/>
-    <w:lsdException w:name="List Continue 4" w:semiHidden="1" w:unhideWhenUsed="1"/>
-    <w:lsdException w:name="List Continue 5" w:semiHidden="1" w:unhideWhenUsed="1"/>
-    <w:lsdException w:name="Message Header" w:semiHidden="1" w:unhideWhenUsed="1"/>
-    <w:lsdException w:name="Body Text First Indent 2" w:semiHidden="1" w:unhideWhenUsed="1"/>
-    <w:lsdException w:name="Note Heading" w:semiHidden="1" w:unhideWhenUsed="1"/>
-    <w:lsdException w:name="Body Text 2" w:semiHidden="1" w:unhideWhenUsed="1"/>
-    <w:lsdException w:name="Body Text 3" w:semiHidden="1" w:unhideWhenUsed="1"/>
-    <w:lsdException w:name="Body Text Indent 2" w:semiHidden="1" w:unhideWhenUsed="1"/>
-    <w:lsdException w:name="Body Text Indent 3" w:semiHidden="1" w:unhideWhenUsed="1"/>
-    <w:lsdException w:name="Block Text" w:semiHidden="1" w:unhideWhenUsed="1"/>
-    <w:lsdException w:name="Hyperlink" w:semiHidden="1" w:unhideWhenUsed="1"/>
-    <w:lsdException w:name="FollowedHyperlink" w:semiHidden="1" w:unhideWhenUsed="1"/>
-    <w:lsdException w:name="Strong" w:uiPriority="22" w:qFormat="1"/>
-    <w:lsdException w:name="Document Map" w:semiHidden="1" w:unhideWhenUsed="1"/>
-    <w:lsdException w:name="Plain Text" w:semiHidden="1" w:unhideWhenUsed="1"/>
-    <w:lsdException w:name="E-mail Signature" w:semiHidden="1" w:unhideWhenUsed="1"/>
-    <w:lsdException w:name="HTML Top of Form" w:semiHidden="1" w:unhideWhenUsed="1"/>
-    <w:lsdException w:name="HTML Bottom of Form" w:semiHidden="1" w:unhideWhenUsed="1"/>
-    <w:lsdException w:name="Normal (Web)" w:semiHidden="1" w:uiPriority="99" w:unhideWhenUsed="1"/>
-    <w:lsdException w:name="HTML Acronym" w:semiHidden="1" w:unhideWhenUsed="1"/>
-    <w:lsdException w:name="HTML Address" w:semiHidden="1" w:unhideWhenUsed="1"/>
-    <w:lsdException w:name="HTML Cite" w:semiHidden="1" w:unhideWhenUsed="1"/>
-    <w:lsdException w:name="HTML Code" w:semiHidden="1" w:unhideWhenUsed="1"/>
-    <w:lsdException w:name="HTML Definition" w:semiHidden="1" w:unhideWhenUsed="1"/>
-    <w:lsdException w:name="HTML Keyboard" w:semiHidden="1" w:unhideWhenUsed="1"/>
-    <w:lsdException w:name="HTML Preformatted" w:semiHidden="1" w:unhideWhenUsed="1"/>
-    <w:lsdException w:name="HTML Sample" w:semiHidden="1" w:unhideWhenUsed="1"/>
-    <w:lsdException w:name="HTML Typewriter" w:semiHidden="1" w:unhideWhenUsed="1"/>
-    <w:lsdException w:name="HTML Variable" w:semiHidden="1" w:unhideWhenUsed="1"/>
-    <w:lsdException w:name="Normal Table" w:semiHidden="1" w:unhideWhenUsed="1"/>
-    <w:lsdException w:name="annotation subject" w:semiHidden="1" w:unhideWhenUsed="1"/>
-    <w:lsdException w:name="No List" w:semiHidden="1" w:unhideWhenUsed="1"/>
-    <w:lsdException w:name="Outline List 1" w:semiHidden="1" w:unhideWhenUsed="1"/>
-    <w:lsdException w:name="Outline List 2" w:semiHidden="1" w:unhideWhenUsed="1"/>
-    <w:lsdException w:name="Outline List 3" w:semiHidden="1" w:unhideWhenUsed="1"/>
-    <w:lsdException w:name="Table Simple 1" w:semiHidden="1" w:unhideWhenUsed="1"/>
-    <w:lsdException w:name="Table Simple 2" w:semiHidden="1" w:unhideWhenUsed="1"/>
-    <w:lsdException w:name="Table Simple 3" w:semiHidden="1" w:unhideWhenUsed="1"/>
-    <w:lsdException w:name="Table Classic 1" w:semiHidden="1" w:unhideWhenUsed="1"/>
-    <w:lsdException w:name="Table Classic 2" w:semiHidden="1" w:unhideWhenUsed="1"/>
-    <w:lsdException w:name="Table Classic 3" w:semiHidden="1" w:unhideWhenUsed="1"/>
-    <w:lsdException w:name="Table Classic 4" w:semiHidden="1" w:unhideWhenUsed="1"/>
-    <w:lsdException w:name="Table Colorful 1" w:semiHidden="1" w:unhideWhenUsed="1"/>
-    <w:lsdException w:name="Table Colorful 2" w:semiHidden="1" w:unhideWhenUsed="1"/>
-    <w:lsdException w:name="Table Colorful 3" w:semiHidden="1" w:unhideWhenUsed="1"/>
-    <w:lsdException w:name="Table Columns 1" w:semiHidden="1" w:unhideWhenUsed="1"/>
-    <w:lsdException w:name="Table Columns 2" w:semiHidden="1" w:unhideWhenUsed="1"/>
-    <w:lsdException w:name="Table Columns 3" w:semiHidden="1" w:unhideWhenUsed="1"/>
-    <w:lsdException w:name="Table Columns 4" w:semiHidden="1" w:unhideWhenUsed="1"/>
-    <w:lsdException w:name="Table Columns 5" w:semiHidden="1" w:unhideWhenUsed="1"/>
-    <w:lsdException w:name="Table Grid 1" w:semiHidden="1" w:unhideWhenUsed="1"/>
-    <w:lsdException w:name="Table Grid 2" w:semiHidden="1" w:unhideWhenUsed="1"/>
-    <w:lsdException w:name="Table Grid 3" w:semiHidden="1" w:unhideWhenUsed="1"/>
-    <w:lsdException w:name="Table Grid 4" w:semiHidden="1" w:unhideWhenUsed="1"/>
-    <w:lsdException w:name="Table Grid 5" w:semiHidden="1" w:unhideWhenUsed="1"/>
-    <w:lsdException w:name="Table Grid 6" w:semiHidden="1" w:unhideWhenUsed="1"/>
-    <w:lsdException w:name="Table Grid 7" w:semiHidden="1" w:unhideWhenUsed="1"/>
-    <w:lsdException w:name="Table Grid 8" w:semiHidden="1" w:unhideWhenUsed="1"/>
-    <w:lsdException w:name="Table List 1" w:semiHidden="1" w:unhideWhenUsed="1"/>
-    <w:lsdException w:name="Table List 2" w:semiHidden="1" w:unhideWhenUsed="1"/>
-    <w:lsdException w:name="Table List 3" w:semiHidden="1" w:unhideWhenUsed="1"/>
-    <w:lsdException w:name="Table List 4" w:semiHidden="1" w:unhideWhenUsed="1"/>
-    <w:lsdException w:name="Table List 5" w:semiHidden="1" w:unhideWhenUsed="1"/>
-    <w:lsdException w:name="Table List 6" w:semiHidden="1" w:unhideWhenUsed="1"/>
-    <w:lsdException w:name="Table List 7" w:semiHidden="1" w:unhideWhenUsed="1"/>
-    <w:lsdException w:name="Table List 8" w:semiHidden="1" w:unhideWhenUsed="1"/>
-    <w:lsdException w:name="Table 3D effects 1" w:semiHidden="1" w:unhideWhenUsed="1"/>
-    <w:lsdException w:name="Table 3D effects 2" w:semiHidden="1" w:unhideWhenUsed="1"/>
-    <w:lsdException w:name="Table 3D effects 3" w:semiHidden="1" w:unhideWhenUsed="1"/>
-    <w:lsdException w:name="Table Contemporary" w:semiHidden="1" w:unhideWhenUsed="1"/>
-    <w:lsdException w:name="Table Elegant" w:semiHidden="1" w:unhideWhenUsed="1"/>
-    <w:lsdException w:name="Table Professional" w:semiHidden="1" w:unhideWhenUsed="1"/>
-    <w:lsdException w:name="Table Subtle 1" w:semiHidden="1" w:unhideWhenUsed="1"/>
-    <w:lsdException w:name="Table Subtle 2" w:semiHidden="1" w:unhideWhenUsed="1"/>
-    <w:lsdException w:name="Table Web 1" w:semiHidden="1" w:unhideWhenUsed="1"/>
-    <w:lsdException w:name="Table Web 2" w:semiHidden="1" w:unhideWhenUsed="1"/>
-    <w:lsdException w:name="Table Web 3" w:semiHidden="1" w:unhideWhenUsed="1"/>
-    <w:lsdException w:name="Balloon Text" w:semiHidden="1" w:unhideWhenUsed="1"/>
-    <w:lsdException w:name="Table Theme" w:semiHidden="1" w:unhideWhenUsed="1"/>
-    <w:lsdException w:name="Medium List 1"/>
-    <w:lsdException w:name="Medium List 2"/>
-    <w:lsdException w:name="Medium Grid 1"/>
-    <w:lsdException w:name="Medium Grid 2"/>
-    <w:lsdException w:name="Medium Grid 3"/>
-    <w:lsdException w:name="Dark List"/>
-    <w:lsdException w:name="Colorful Shading"/>
-    <w:lsdException w:name="Colorful List"/>
-    <w:lsdException w:name="Colorful Grid"/>
-    <w:lsdException w:name="Light Shading Accent 1"/>
-    <w:lsdException w:name="Light List Accent 1"/>
-    <w:lsdException w:name="Light Grid Accent 1"/>
-    <w:lsdException w:name="Medium Shading 1 Accent 1"/>
-    <w:lsdException w:name="Medium Shading 2 Accent 1"/>
-    <w:lsdException w:name="Medium List 1 Accent 1"/>
-    <w:lsdException w:name="Revision" w:semiHidden="1"/>
-    <w:lsdException w:name="Medium List 2 Accent 1"/>
-    <w:lsdException w:name="Medium Grid 1 Accent 1"/>
-    <w:lsdException w:name="Medium Grid 2 Accent 1"/>
-    <w:lsdException w:name="Medium Grid 3 Accent 1"/>
-    <w:lsdException w:name="Dark List Accent 1"/>
-    <w:lsdException w:name="Colorful Shading Accent 1"/>
-    <w:lsdException w:name="Colorful List Accent 1"/>
-    <w:lsdException w:name="Colorful Grid Accent 1"/>
-    <w:lsdException w:name="Light Shading Accent 2"/>
-    <w:lsdException w:name="Light List Accent 2"/>
-    <w:lsdException w:name="Light Grid Accent 2"/>
-    <w:lsdException w:name="Medium Shading 1 Accent 2"/>
-    <w:lsdException w:name="Medium Shading 2 Accent 2"/>
-    <w:lsdException w:name="Medium List 1 Accent 2"/>
-    <w:lsdException w:name="Medium List 2 Accent 2"/>
-    <w:lsdException w:name="Medium Grid 1 Accent 2"/>
-    <w:lsdException w:name="Medium Grid 2 Accent 2"/>
-    <w:lsdException w:name="Medium Grid 3 Accent 2"/>
-    <w:lsdException w:name="Dark List Accent 2"/>
-    <w:lsdException w:name="Colorful Shading Accent 2"/>
-    <w:lsdException w:name="Colorful List Accent 2"/>
-    <w:lsdException w:name="Colorful Grid Accent 2"/>
-    <w:lsdException w:name="Light Shading Accent 3"/>
-    <w:lsdException w:name="Light List Accent 3"/>
-    <w:lsdException w:name="Light Grid Accent 3"/>
-    <w:lsdException w:name="Medium Shading 1 Accent 3"/>
-    <w:lsdException w:name="Medium Shading 2 Accent 3"/>
-    <w:lsdException w:name="Medium List 1 Accent 3"/>
-    <w:lsdException w:name="Medium List 2 Accent 3"/>
-    <w:lsdException w:name="Medium Grid 1 Accent 3"/>
-    <w:lsdException w:name="Medium Grid 2 Accent 3"/>
-    <w:lsdException w:name="Medium Grid 3 Accent 3"/>
-    <w:lsdException w:name="Dark List Accent 3"/>
-    <w:lsdException w:name="Colorful Shading Accent 3"/>
-    <w:lsdException w:name="Colorful List Accent 3"/>
-    <w:lsdException w:name="Colorful Grid Accent 3"/>
-    <w:lsdException w:name="Light Shading Accent 4"/>
-    <w:lsdException w:name="Light List Accent 4"/>
-    <w:lsdException w:name="Light Grid Accent 4"/>
-    <w:lsdException w:name="Medium Shading 1 Accent 4"/>
-    <w:lsdException w:name="Medium Shading 2 Accent 4"/>
-    <w:lsdException w:name="Medium List 1 Accent 4"/>
-    <w:lsdException w:name="Medium List 2 Accent 4"/>
-    <w:lsdException w:name="Medium Grid 1 Accent 4"/>
-    <w:lsdException w:name="Medium Grid 2 Accent 4"/>
-    <w:lsdException w:name="Medium Grid 3 Accent 4"/>
-    <w:lsdException w:name="Dark List Accent 4"/>
-    <w:lsdException w:name="Colorful Shading Accent 4"/>
-    <w:lsdException w:name="Colorful List Accent 4"/>
-    <w:lsdException w:name="Colorful Grid Accent 4"/>
-    <w:lsdException w:name="Light Shading Accent 5"/>
-    <w:lsdException w:name="Light List Accent 5"/>
-    <w:lsdException w:name="Light Grid Accent 5"/>
-    <w:lsdException w:name="Medium Shading 1 Accent 5"/>
-    <w:lsdException w:name="Medium Shading 2 Accent 5"/>
-    <w:lsdException w:name="Medium List 1 Accent 5"/>
-    <w:lsdException w:name="Medium List 2 Accent 5"/>
-    <w:lsdException w:name="Medium Grid 1 Accent 5"/>
-    <w:lsdException w:name="Medium Grid 2 Accent 5"/>
-    <w:lsdException w:name="Medium Grid 3 Accent 5"/>
-    <w:lsdException w:name="Dark List Accent 5"/>
-    <w:lsdException w:name="Colorful Shading Accent 5"/>
-    <w:lsdException w:name="Colorful List Accent 5"/>
-    <w:lsdException w:name="Colorful Grid Accent 5"/>
-    <w:lsdException w:name="Light Shading Accent 6"/>
-    <w:lsdException w:name="Light List Accent 6"/>
-    <w:lsdException w:name="Light Grid Accent 6"/>
-    <w:lsdException w:name="Medium Shading 1 Accent 6"/>
-    <w:lsdException w:name="Medium Shading 2 Accent 6"/>
-    <w:lsdException w:name="Medium List 1 Accent 6"/>
-    <w:lsdException w:name="Medium List 2 Accent 6"/>
-    <w:lsdException w:name="Medium Grid 1 Accent 6"/>
-    <w:lsdException w:name="Medium Grid 2 Accent 6"/>
-    <w:lsdException w:name="Medium Grid 3 Accent 6"/>
-    <w:lsdException w:name="Dark List Accent 6"/>
-    <w:lsdException w:name="Colorful Shading Accent 6"/>
-    <w:lsdException w:name="Colorful List Accent 6"/>
-    <w:lsdException w:name="Colorful Grid Accent 6"/>
-    <w:lsdException w:name="Bibliography" w:semiHidden="1" w:unhideWhenUsed="1"/>
-    <w:lsdException w:name="TOC Heading" w:semiHidden="1" w:unhideWhenUsed="1"/>
-    <w:lsdException w:name="Plain Table 1" w:uiPriority="41"/>
-    <w:lsdException w:name="Plain Table 2" w:uiPriority="42"/>
-    <w:lsdException w:name="Plain Table 3" w:uiPriority="43"/>
-    <w:lsdException w:name="Plain Table 4" w:uiPriority="44"/>
-    <w:lsdException w:name="Plain Table 5" w:uiPriority="45"/>
-    <w:lsdException w:name="Grid Table Light" w:uiPriority="40"/>
-    <w:lsdException w:name="Grid Table 1 Light" w:uiPriority="46"/>
-    <w:lsdException w:name="Grid Table 2" w:uiPriority="47"/>
-    <w:lsdException w:name="Grid Table 3" w:uiPriority="48"/>
-    <w:lsdException w:name="Grid Table 4" w:uiPriority="49"/>
-    <w:lsdException w:name="Grid Table 5 Dark" w:uiPriority="50"/>
-    <w:lsdException w:name="Grid Table 6 Colorful" w:uiPriority="51"/>
-    <w:lsdException w:name="Grid Table 7 Colorful" w:uiPriority="52"/>
-    <w:lsdException w:name="Grid Table 1 Light Accent 1" w:uiPriority="46"/>
-    <w:lsdException w:name="Grid Table 2 Accent 1" w:uiPriority="47"/>
-    <w:lsdException w:name="Grid Table 3 Accent 1" w:uiPriority="48"/>
-    <w:lsdException w:name="Grid Table 4 Accent 1" w:uiPriority="49"/>
-    <w:lsdException w:name="Grid Table 5 Dark Accent 1" w:uiPriority="50"/>
-    <w:lsdException w:name="Grid Table 6 Colorful Accent 1" w:uiPriority="51"/>
-    <w:lsdException w:name="Grid Table 7 Colorful Accent 1" w:uiPriority="52"/>
-    <w:lsdException w:name="Grid Table 1 Light Accent 2" w:uiPriority="46"/>
-    <w:lsdException w:name="Grid Table 2 Accent 2" w:uiPriority="47"/>
-    <w:lsdException w:name="Grid Table 3 Accent 2" w:uiPriority="48"/>
-    <w:lsdException w:name="Grid Table 4 Accent 2" w:uiPriority="49"/>
-    <w:lsdException w:name="Grid Table 5 Dark Accent 2" w:uiPriority="50"/>
-    <w:lsdException w:name="Grid Table 6 Colorful Accent 2" w:uiPriority="51"/>
-    <w:lsdException w:name="Grid Table 7 Colorful Accent 2" w:uiPriority="52"/>
-    <w:lsdException w:name="Grid Table 1 Light Accent 3" w:uiPriority="46"/>
-    <w:lsdException w:name="Grid Table 2 Accent 3" w:uiPriority="47"/>
-    <w:lsdException w:name="Grid Table 3 Accent 3" w:uiPriority="48"/>
-    <w:lsdException w:name="Grid Table 4 Accent 3" w:uiPriority="49"/>
-    <w:lsdException w:name="Grid Table 5 Dark Accent 3" w:uiPriority="50"/>
-    <w:lsdException w:name="Grid Table 6 Colorful Accent 3" w:uiPriority="51"/>
-    <w:lsdException w:name="Grid Table 7 Colorful Accent 3" w:uiPriority="52"/>
-    <w:lsdException w:name="Grid Table 1 Light Accent 4" w:uiPriority="46"/>
-    <w:lsdException w:name="Grid Table 2 Accent 4" w:uiPriority="47"/>
-    <w:lsdException w:name="Grid Table 3 Accent 4" w:uiPriority="48"/>
-    <w:lsdException w:name="Grid Table 4 Accent 4" w:uiPriority="49"/>
-    <w:lsdException w:name="Grid Table 5 Dark Accent 4" w:uiPriority="50"/>
-    <w:lsdException w:name="Grid Table 6 Colorful Accent 4" w:uiPriority="51"/>
-    <w:lsdException w:name="Grid Table 7 Colorful Accent 4" w:uiPriority="52"/>
-    <w:lsdException w:name="Grid Table 1 Light Accent 5" w:uiPriority="46"/>
-    <w:lsdException w:name="Grid Table 2 Accent 5" w:uiPriority="47"/>
-    <w:lsdException w:name="Grid Table 3 Accent 5" w:uiPriority="48"/>
-    <w:lsdException w:name="Grid Table 4 Accent 5" w:uiPriority="49"/>
-    <w:lsdException w:name="Grid Table 5 Dark Accent 5" w:uiPriority="50"/>
-    <w:lsdException w:name="Grid Table 6 Colorful Accent 5" w:uiPriority="51"/>
-    <w:lsdException w:name="Grid Table 7 Colorful Accent 5" w:uiPriority="52"/>
-    <w:lsdException w:name="Grid Table 1 Light Accent 6" w:uiPriority="46"/>
-    <w:lsdException w:name="Grid Table 2 Accent 6" w:uiPriority="47"/>
-    <w:lsdException w:name="Grid Table 3 Accent 6" w:uiPriority="48"/>
-    <w:lsdException w:name="Grid Table 4 Accent 6" w:uiPriority="49"/>
-    <w:lsdException w:name="Grid Table 5 Dark Accent 6" w:uiPriority="50"/>
-    <w:lsdException w:name="Grid Table 6 Colorful Accent 6" w:uiPriority="51"/>
-    <w:lsdException w:name="Grid Table 7 Colorful Accent 6" w:uiPriority="52"/>
-    <w:lsdException w:name="List Table 1 Light" w:uiPriority="46"/>
-    <w:lsdException w:name="List Table 2" w:uiPriority="47"/>
-    <w:lsdException w:name="List Table 3" w:uiPriority="48"/>
-    <w:lsdException w:name="List Table 4" w:uiPriority="49"/>
-    <w:lsdException w:name="List Table 5 Dark" w:uiPriority="50"/>
-    <w:lsdException w:name="List Table 6 Colorful" w:uiPriority="51"/>
-    <w:lsdException w:name="List Table 7 Colorful" w:uiPriority="52"/>
-    <w:lsdException w:name="List Table 1 Light Accent 1" w:uiPriority="46"/>
-    <w:lsdException w:name="List Table 2 Accent 1" w:uiPriority="47"/>
-    <w:lsdException w:name="List Table 3 Accent 1" w:uiPriority="48"/>
-    <w:lsdException w:name="List Table 4 Accent 1" w:uiPriority="49"/>
-    <w:lsdException w:name="List Table 5 Dark Accent 1" w:uiPriority="50"/>
-    <w:lsdException w:name="List Table 6 Colorful Accent 1" w:uiPriority="51"/>
-    <w:lsdException w:name="List Table 7 Colorful Accent 1" w:uiPriority="52"/>
-    <w:lsdException w:name="List Table 1 Light Accent 2" w:uiPriority="46"/>
-    <w:lsdException w:name="List Table 2 Accent 2" w:uiPriority="47"/>
-    <w:lsdException w:name="List Table 3 Accent 2" w:uiPriority="48"/>
-    <w:lsdException w:name="List Table 4 Accent 2" w:uiPriority="49"/>
-    <w:lsdException w:name="List Table 5 Dark Accent 2" w:uiPriority="50"/>
-    <w:lsdException w:name="List Table 6 Colorful Accent 2" w:uiPriority="51"/>
-    <w:lsdException w:name="List Table 7 Colorful Accent 2" w:uiPriority="52"/>
-    <w:lsdException w:name="List Table 1 Light Accent 3" w:uiPriority="46"/>
-    <w:lsdException w:name="List Table 2 Accent 3" w:uiPriority="47"/>
-    <w:lsdException w:name="List Table 3 Accent 3" w:uiPriority="48"/>
-    <w:lsdException w:name="List Table 4 Accent 3" w:uiPriority="49"/>
-    <w:lsdException w:name="List Table 5 Dark Accent 3" w:uiPriority="50"/>
-    <w:lsdException w:name="List Table 6 Colorful Accent 3" w:uiPriority="51"/>
-    <w:lsdException w:name="List Table 7 Colorful Accent 3" w:uiPriority="52"/>
-    <w:lsdException w:name="List Table 1 Light Accent 4" w:uiPriority="46"/>
-    <w:lsdException w:name="List Table 2 Accent 4" w:uiPriority="47"/>
-    <w:lsdException w:name="List Table 3 Accent 4" w:uiPriority="48"/>
-    <w:lsdException w:name="List Table 4 Accent 4" w:uiPriority="49"/>
-    <w:lsdException w:name="List Table 5 Dark Accent 4" w:uiPriority="50"/>
-    <w:lsdException w:name="List Table 6 Colorful Accent 4" w:uiPriority="51"/>
-    <w:lsdException w:name="List Table 7 Colorful Accent 4" w:uiPriority="52"/>
-    <w:lsdException w:name="List Table 1 Light Accent 5" w:uiPriority="46"/>
-    <w:lsdException w:name="List Table 2 Accent 5" w:uiPriority="47"/>
-    <w:lsdException w:name="List Table 3 Accent 5" w:uiPriority="48"/>
-    <w:lsdException w:name="List Table 4 Accent 5" w:uiPriority="49"/>
-    <w:lsdException w:name="List Table 5 Dark Accent 5" w:uiPriority="50"/>
-    <w:lsdException w:name="List Table 6 Colorful Accent 5" w:uiPriority="51"/>
-    <w:lsdException w:name="List Table 7 Colorful Accent 5" w:uiPriority="52"/>
-    <w:lsdException w:name="List Table 1 Light Accent 6" w:uiPriority="46"/>
-    <w:lsdException w:name="List Table 2 Accent 6" w:uiPriority="47"/>
-    <w:lsdException w:name="List Table 3 Accent 6" w:uiPriority="48"/>
-    <w:lsdException w:name="List Table 4 Accent 6" w:uiPriority="49"/>
-    <w:lsdException w:name="List Table 5 Dark Accent 6" w:uiPriority="50"/>
-    <w:lsdException w:name="List Table 6 Colorful Accent 6" w:uiPriority="51"/>
-    <w:lsdException w:name="List Table 7 Colorful Accent 6" w:uiPriority="52"/>
+  <w:latentStyles w:defLockedState="0" w:defUIPriority="0" w:defSemiHidden="1" w:defUnhideWhenUsed="1" w:defQFormat="0" w:count="267">
+    <w:lsdException w:name="Normal" w:semiHidden="0" w:unhideWhenUsed="0"/>
+    <w:lsdException w:name="heading 1" w:semiHidden="0" w:unhideWhenUsed="0"/>
+    <w:lsdException w:name="heading 2" w:semiHidden="0" w:unhideWhenUsed="0"/>
+    <w:lsdException w:name="heading 3" w:semiHidden="0" w:unhideWhenUsed="0"/>
+    <w:lsdException w:name="heading 4" w:semiHidden="0" w:unhideWhenUsed="0"/>
+    <w:lsdException w:name="heading 5" w:semiHidden="0" w:unhideWhenUsed="0"/>
+    <w:lsdException w:name="heading 6" w:semiHidden="0" w:unhideWhenUsed="0"/>
+    <w:lsdException w:name="List Number" w:semiHidden="0" w:unhideWhenUsed="0"/>
+    <w:lsdException w:name="List 4" w:semiHidden="0" w:unhideWhenUsed="0"/>
+    <w:lsdException w:name="List 5" w:semiHidden="0" w:unhideWhenUsed="0"/>
+    <w:lsdException w:name="Title" w:semiHidden="0" w:unhideWhenUsed="0"/>
+    <w:lsdException w:name="Subtitle" w:semiHidden="0" w:unhideWhenUsed="0"/>
+    <w:lsdException w:name="Salutation" w:semiHidden="0" w:unhideWhenUsed="0"/>
+    <w:lsdException w:name="Date" w:semiHidden="0" w:unhideWhenUsed="0"/>
+    <w:lsdException w:name="Body Text First Indent" w:semiHidden="0" w:unhideWhenUsed="0"/>
+    <w:lsdException w:name="Strong" w:semiHidden="0" w:uiPriority="22" w:unhideWhenUsed="0" w:qFormat="1"/>
+    <w:lsdException w:name="Emphasis" w:semiHidden="0" w:unhideWhenUsed="0"/>
+    <w:lsdException w:name="Normal (Web)" w:uiPriority="99"/>
+    <w:lsdException w:name="Table Grid" w:semiHidden="0" w:unhideWhenUsed="0"/>
+    <w:lsdException w:name="Placeholder Text" w:semiHidden="0" w:unhideWhenUsed="0"/>
+    <w:lsdException w:name="No Spacing" w:semiHidden="0" w:unhideWhenUsed="0"/>
+    <w:lsdException w:name="Light Shading" w:semiHidden="0" w:unhideWhenUsed="0"/>
+    <w:lsdException w:name="Light List" w:semiHidden="0" w:unhideWhenUsed="0"/>
+    <w:lsdException w:name="Light Grid" w:semiHidden="0" w:unhideWhenUsed="0"/>
+    <w:lsdException w:name="Medium Shading 1" w:semiHidden="0" w:unhideWhenUsed="0"/>
+    <w:lsdException w:name="Medium Shading 2" w:semiHidden="0" w:unhideWhenUsed="0"/>
+    <w:lsdException w:name="Medium List 1" w:semiHidden="0" w:unhideWhenUsed="0"/>
+    <w:lsdException w:name="Medium List 2" w:semiHidden="0" w:unhideWhenUsed="0"/>
+    <w:lsdException w:name="Medium Grid 1" w:semiHidden="0" w:unhideWhenUsed="0"/>
+    <w:lsdException w:name="Medium Grid 2" w:semiHidden="0" w:unhideWhenUsed="0"/>
+    <w:lsdException w:name="Medium Grid 3" w:semiHidden="0" w:unhideWhenUsed="0"/>
+    <w:lsdException w:name="Dark List" w:semiHidden="0" w:unhideWhenUsed="0"/>
+    <w:lsdException w:name="Colorful Shading" w:semiHidden="0" w:unhideWhenUsed="0"/>
+    <w:lsdException w:name="Colorful List" w:semiHidden="0" w:unhideWhenUsed="0"/>
+    <w:lsdException w:name="Colorful Grid" w:semiHidden="0" w:unhideWhenUsed="0"/>
+    <w:lsdException w:name="Light Shading Accent 1" w:semiHidden="0" w:unhideWhenUsed="0"/>
+    <w:lsdException w:name="Light List Accent 1" w:semiHidden="0" w:unhideWhenUsed="0"/>
+    <w:lsdException w:name="Light Grid Accent 1" w:semiHidden="0" w:unhideWhenUsed="0"/>
+    <w:lsdException w:name="Medium Shading 1 Accent 1" w:semiHidden="0" w:unhideWhenUsed="0"/>
+    <w:lsdException w:name="Medium Shading 2 Accent 1" w:semiHidden="0" w:unhideWhenUsed="0"/>
+    <w:lsdException w:name="Medium List 1 Accent 1" w:semiHidden="0" w:unhideWhenUsed="0"/>
+    <w:lsdException w:name="Revision" w:unhideWhenUsed="0"/>
+    <w:lsdException w:name="List Paragraph" w:semiHidden="0" w:unhideWhenUsed="0"/>
+    <w:lsdException w:name="Quote" w:semiHidden="0" w:unhideWhenUsed="0"/>
+    <w:lsdException w:name="Intense Quote" w:semiHidden="0" w:unhideWhenUsed="0"/>
+    <w:lsdException w:name="Medium List 2 Accent 1" w:semiHidden="0" w:unhideWhenUsed="0"/>
+    <w:lsdException w:name="Medium Grid 1 Accent 1" w:semiHidden="0" w:unhideWhenUsed="0"/>
+    <w:lsdException w:name="Medium Grid 2 Accent 1" w:semiHidden="0" w:unhideWhenUsed="0"/>
+    <w:lsdException w:name="Medium Grid 3 Accent 1" w:semiHidden="0" w:unhideWhenUsed="0"/>
+    <w:lsdException w:name="Dark List Accent 1" w:semiHidden="0" w:unhideWhenUsed="0"/>
+    <w:lsdException w:name="Colorful Shading Accent 1" w:semiHidden="0" w:unhideWhenUsed="0"/>
+    <w:lsdException w:name="Colorful List Accent 1" w:semiHidden="0" w:unhideWhenUsed="0"/>
+    <w:lsdException w:name="Colorful Grid Accent 1" w:semiHidden="0" w:unhideWhenUsed="0"/>
+    <w:lsdException w:name="Light Shading Accent 2" w:semiHidden="0" w:unhideWhenUsed="0"/>
+    <w:lsdException w:name="Light List Accent 2" w:semiHidden="0" w:unhideWhenUsed="0"/>
+    <w:lsdException w:name="Light Grid Accent 2" w:semiHidden="0" w:unhideWhenUsed="0"/>
+    <w:lsdException w:name="Medium Shading 1 Accent 2" w:semiHidden="0" w:unhideWhenUsed="0"/>
+    <w:lsdException w:name="Medium Shading 2 Accent 2" w:semiHidden="0" w:unhideWhenUsed="0"/>
+    <w:lsdException w:name="Medium List 1 Accent 2" w:semiHidden="0" w:unhideWhenUsed="0"/>
+    <w:lsdException w:name="Medium List 2 Accent 2" w:semiHidden="0" w:unhideWhenUsed="0"/>
+    <w:lsdException w:name="Medium Grid 1 Accent 2" w:semiHidden="0" w:unhideWhenUsed="0"/>
+    <w:lsdException w:name="Medium Grid 2 Accent 2" w:semiHidden="0" w:unhideWhenUsed="0"/>
+    <w:lsdException w:name="Medium Grid 3 Accent 2" w:semiHidden="0" w:unhideWhenUsed="0"/>
+    <w:lsdException w:name="Dark List Accent 2" w:semiHidden="0" w:unhideWhenUsed="0"/>
+    <w:lsdException w:name="Colorful Shading Accent 2" w:semiHidden="0" w:unhideWhenUsed="0"/>
+    <w:lsdException w:name="Colorful List Accent 2" w:semiHidden="0" w:unhideWhenUsed="0"/>
+    <w:lsdException w:name="Colorful Grid Accent 2" w:semiHidden="0" w:unhideWhenUsed="0"/>
+    <w:lsdException w:name="Light Shading Accent 3" w:semiHidden="0" w:unhideWhenUsed="0"/>
+    <w:lsdException w:name="Light List Accent 3" w:semiHidden="0" w:unhideWhenUsed="0"/>
+    <w:lsdException w:name="Light Grid Accent 3" w:semiHidden="0" w:unhideWhenUsed="0"/>
+    <w:lsdException w:name="Medium Shading 1 Accent 3" w:semiHidden="0" w:unhideWhenUsed="0"/>
+    <w:lsdException w:name="Medium Shading 2 Accent 3" w:semiHidden="0" w:unhideWhenUsed="0"/>
+    <w:lsdException w:name="Medium List 1 Accent 3" w:semiHidden="0" w:unhideWhenUsed="0"/>
+    <w:lsdException w:name="Medium List 2 Accent 3" w:semiHidden="0" w:unhideWhenUsed="0"/>
+    <w:lsdException w:name="Medium Grid 1 Accent 3" w:semiHidden="0" w:unhideWhenUsed="0"/>
+    <w:lsdException w:name="Medium Grid 2 Accent 3" w:semiHidden="0" w:unhideWhenUsed="0"/>
+    <w:lsdException w:name="Medium Grid 3 Accent 3" w:semiHidden="0" w:unhideWhenUsed="0"/>
+    <w:lsdException w:name="Dark List Accent 3" w:semiHidden="0" w:unhideWhenUsed="0"/>
+    <w:lsdException w:name="Colorful Shading Accent 3" w:semiHidden="0" w:unhideWhenUsed="0"/>
+    <w:lsdException w:name="Colorful List Accent 3" w:semiHidden="0" w:unhideWhenUsed="0"/>
+    <w:lsdException w:name="Colorful Grid Accent 3" w:semiHidden="0" w:unhideWhenUsed="0"/>
+    <w:lsdException w:name="Light Shading Accent 4" w:semiHidden="0" w:unhideWhenUsed="0"/>
+    <w:lsdException w:name="Light List Accent 4" w:semiHidden="0" w:unhideWhenUsed="0"/>
+    <w:lsdException w:name="Light Grid Accent 4" w:semiHidden="0" w:unhideWhenUsed="0"/>
+    <w:lsdException w:name="Medium Shading 1 Accent 4" w:semiHidden="0" w:unhideWhenUsed="0"/>
+    <w:lsdException w:name="Medium Shading 2 Accent 4" w:semiHidden="0" w:unhideWhenUsed="0"/>
+    <w:lsdException w:name="Medium List 1 Accent 4" w:semiHidden="0" w:unhideWhenUsed="0"/>
+    <w:lsdException w:name="Medium List 2 Accent 4" w:semiHidden="0" w:unhideWhenUsed="0"/>
+    <w:lsdException w:name="Medium Grid 1 Accent 4" w:semiHidden="0" w:unhideWhenUsed="0"/>
+    <w:lsdException w:name="Medium Grid 2 Accent 4" w:semiHidden="0" w:unhideWhenUsed="0"/>
+    <w:lsdException w:name="Medium Grid 3 Accent 4" w:semiHidden="0" w:unhideWhenUsed="0"/>
+    <w:lsdException w:name="Dark List Accent 4" w:semiHidden="0" w:unhideWhenUsed="0"/>
+    <w:lsdException w:name="Colorful Shading Accent 4" w:semiHidden="0" w:unhideWhenUsed="0"/>
+    <w:lsdException w:name="Colorful List Accent 4" w:semiHidden="0" w:unhideWhenUsed="0"/>
+    <w:lsdException w:name="Colorful Grid Accent 4" w:semiHidden="0" w:unhideWhenUsed="0"/>
+    <w:lsdException w:name="Light Shading Accent 5" w:semiHidden="0" w:unhideWhenUsed="0"/>
+    <w:lsdException w:name="Light List Accent 5" w:semiHidden="0" w:unhideWhenUsed="0"/>
+    <w:lsdException w:name="Light Grid Accent 5" w:semiHidden="0" w:unhideWhenUsed="0"/>
+    <w:lsdException w:name="Medium Shading 1 Accent 5" w:semiHidden="0" w:unhideWhenUsed="0"/>
+    <w:lsdException w:name="Medium Shading 2 Accent 5" w:semiHidden="0" w:unhideWhenUsed="0"/>
+    <w:lsdException w:name="Medium List 1 Accent 5" w:semiHidden="0" w:unhideWhenUsed="0"/>
+    <w:lsdException w:name="Medium List 2 Accent 5" w:semiHidden="0" w:unhideWhenUsed="0"/>
+    <w:lsdException w:name="Medium Grid 1 Accent 5" w:semiHidden="0" w:unhideWhenUsed="0"/>
+    <w:lsdException w:name="Medium Grid 2 Accent 5" w:semiHidden="0" w:unhideWhenUsed="0"/>
+    <w:lsdException w:name="Medium Grid 3 Accent 5" w:semiHidden="0" w:unhideWhenUsed="0"/>
+    <w:lsdException w:name="Dark List Accent 5" w:semiHidden="0" w:unhideWhenUsed="0"/>
+    <w:lsdException w:name="Colorful Shading Accent 5" w:semiHidden="0" w:unhideWhenUsed="0"/>
+    <w:lsdException w:name="Colorful List Accent 5" w:semiHidden="0" w:unhideWhenUsed="0"/>
+    <w:lsdException w:name="Colorful Grid Accent 5" w:semiHidden="0" w:unhideWhenUsed="0"/>
+    <w:lsdException w:name="Light Shading Accent 6" w:semiHidden="0" w:unhideWhenUsed="0"/>
+    <w:lsdException w:name="Light List Accent 6" w:semiHidden="0" w:unhideWhenUsed="0"/>
+    <w:lsdException w:name="Light Grid Accent 6" w:semiHidden="0" w:unhideWhenUsed="0"/>
+    <w:lsdException w:name="Medium Shading 1 Accent 6" w:semiHidden="0" w:unhideWhenUsed="0"/>
+    <w:lsdException w:name="Medium Shading 2 Accent 6" w:semiHidden="0" w:unhideWhenUsed="0"/>
+    <w:lsdException w:name="Medium List 1 Accent 6" w:semiHidden="0" w:unhideWhenUsed="0"/>
+    <w:lsdException w:name="Medium List 2 Accent 6" w:semiHidden="0" w:unhideWhenUsed="0"/>
+    <w:lsdException w:name="Medium Grid 1 Accent 6" w:semiHidden="0" w:unhideWhenUsed="0"/>
+    <w:lsdException w:name="Medium Grid 2 Accent 6" w:semiHidden="0" w:unhideWhenUsed="0"/>
+    <w:lsdException w:name="Medium Grid 3 Accent 6" w:semiHidden="0" w:unhideWhenUsed="0"/>
+    <w:lsdException w:name="Dark List Accent 6" w:semiHidden="0" w:unhideWhenUsed="0"/>
+    <w:lsdException w:name="Colorful Shading Accent 6" w:semiHidden="0" w:unhideWhenUsed="0"/>
+    <w:lsdException w:name="Colorful List Accent 6" w:semiHidden="0" w:unhideWhenUsed="0"/>
+    <w:lsdException w:name="Colorful Grid Accent 6" w:semiHidden="0" w:unhideWhenUsed="0"/>
+    <w:lsdException w:name="Subtle Emphasis" w:semiHidden="0" w:unhideWhenUsed="0"/>
+    <w:lsdException w:name="Intense Emphasis" w:semiHidden="0" w:unhideWhenUsed="0"/>
+    <w:lsdException w:name="Subtle Reference" w:semiHidden="0" w:unhideWhenUsed="0"/>
+    <w:lsdException w:name="Intense Reference" w:semiHidden="0" w:unhideWhenUsed="0"/>
+    <w:lsdException w:name="Book Title" w:semiHidden="0" w:unhideWhenUsed="0"/>
   </w:latentStyles>
   <w:style w:type="paragraph" w:default="1" w:styleId="Normal">
     <w:name w:val="Normal"/>
@@ -3871,6 +3657,196 @@
       <w:b/>
       <w:bCs/>
     </w:rPr>
+  </w:style>
+</w:styles>
+</file>
+
+<file path=word/stylesWithEffects.xml><?xml version="1.0" encoding="utf-8"?>
+<w:styles xmlns:wpc="http://schemas.microsoft.com/office/word/2010/wordprocessingCanvas" xmlns:mc="http://schemas.openxmlformats.org/markup-compatibility/2006" xmlns:o="urn:schemas-microsoft-com:office:office" xmlns:r="http://schemas.openxmlformats.org/officeDocument/2006/relationships" xmlns:m="http://schemas.openxmlformats.org/officeDocument/2006/math" xmlns:v="urn:schemas-microsoft-com:vml" xmlns:wp14="http://schemas.microsoft.com/office/word/2010/wordprocessingDrawing" xmlns:wp="http://schemas.openxmlformats.org/drawingml/2006/wordprocessingDrawing" xmlns:w10="urn:schemas-microsoft-com:office:word" xmlns:w="http://schemas.openxmlformats.org/wordprocessingml/2006/main" xmlns:w14="http://schemas.microsoft.com/office/word/2010/wordml" xmlns:wpg="http://schemas.microsoft.com/office/word/2010/wordprocessingGroup" xmlns:wpi="http://schemas.microsoft.com/office/word/2010/wordprocessingInk" xmlns:wne="http://schemas.microsoft.com/office/word/2006/wordml" xmlns:wps="http://schemas.microsoft.com/office/word/2010/wordprocessingShape" mc:Ignorable="w14 wp14">
+  <w:docDefaults>
+    <w:rPrDefault>
+      <w:rPr>
+        <w:rFonts w:asciiTheme="minorHAnsi" w:eastAsiaTheme="minorEastAsia" w:hAnsiTheme="minorHAnsi" w:cstheme="minorBidi"/>
+        <w:sz w:val="22"/>
+        <w:szCs w:val="22"/>
+        <w:lang w:val="en-US" w:eastAsia="en-US" w:bidi="ar-SA"/>
+      </w:rPr>
+    </w:rPrDefault>
+    <w:pPrDefault>
+      <w:pPr>
+        <w:spacing w:after="200" w:line="276" w:lineRule="auto"/>
+      </w:pPr>
+    </w:pPrDefault>
+  </w:docDefaults>
+  <w:latentStyles w:defLockedState="0" w:defUIPriority="99" w:defSemiHidden="1" w:defUnhideWhenUsed="1" w:defQFormat="0" w:count="267">
+    <w:lsdException w:name="Normal" w:semiHidden="0" w:uiPriority="0" w:unhideWhenUsed="0" w:qFormat="1"/>
+    <w:lsdException w:name="heading 1" w:semiHidden="0" w:uiPriority="9" w:unhideWhenUsed="0" w:qFormat="1"/>
+    <w:lsdException w:name="heading 2" w:uiPriority="9" w:qFormat="1"/>
+    <w:lsdException w:name="heading 3" w:uiPriority="9" w:qFormat="1"/>
+    <w:lsdException w:name="heading 4" w:uiPriority="9" w:qFormat="1"/>
+    <w:lsdException w:name="heading 5" w:uiPriority="9" w:qFormat="1"/>
+    <w:lsdException w:name="heading 6" w:uiPriority="9" w:qFormat="1"/>
+    <w:lsdException w:name="heading 7" w:uiPriority="9" w:qFormat="1"/>
+    <w:lsdException w:name="heading 8" w:uiPriority="9" w:qFormat="1"/>
+    <w:lsdException w:name="heading 9" w:uiPriority="9" w:qFormat="1"/>
+    <w:lsdException w:name="toc 1" w:uiPriority="39"/>
+    <w:lsdException w:name="toc 2" w:uiPriority="39"/>
+    <w:lsdException w:name="toc 3" w:uiPriority="39"/>
+    <w:lsdException w:name="toc 4" w:uiPriority="39"/>
+    <w:lsdException w:name="toc 5" w:uiPriority="39"/>
+    <w:lsdException w:name="toc 6" w:uiPriority="39"/>
+    <w:lsdException w:name="toc 7" w:uiPriority="39"/>
+    <w:lsdException w:name="toc 8" w:uiPriority="39"/>
+    <w:lsdException w:name="toc 9" w:uiPriority="39"/>
+    <w:lsdException w:name="caption" w:uiPriority="35" w:qFormat="1"/>
+    <w:lsdException w:name="Title" w:semiHidden="0" w:uiPriority="10" w:unhideWhenUsed="0" w:qFormat="1"/>
+    <w:lsdException w:name="Default Paragraph Font" w:uiPriority="1"/>
+    <w:lsdException w:name="Subtitle" w:semiHidden="0" w:uiPriority="11" w:unhideWhenUsed="0" w:qFormat="1"/>
+    <w:lsdException w:name="Strong" w:semiHidden="0" w:uiPriority="22" w:unhideWhenUsed="0" w:qFormat="1"/>
+    <w:lsdException w:name="Emphasis" w:semiHidden="0" w:uiPriority="20" w:unhideWhenUsed="0" w:qFormat="1"/>
+    <w:lsdException w:name="Table Grid" w:semiHidden="0" w:uiPriority="59" w:unhideWhenUsed="0"/>
+    <w:lsdException w:name="Placeholder Text" w:unhideWhenUsed="0"/>
+    <w:lsdException w:name="No Spacing" w:semiHidden="0" w:uiPriority="1" w:unhideWhenUsed="0" w:qFormat="1"/>
+    <w:lsdException w:name="Light Shading" w:semiHidden="0" w:uiPriority="60" w:unhideWhenUsed="0"/>
+    <w:lsdException w:name="Light List" w:semiHidden="0" w:uiPriority="61" w:unhideWhenUsed="0"/>
+    <w:lsdException w:name="Light Grid" w:semiHidden="0" w:uiPriority="62" w:unhideWhenUsed="0"/>
+    <w:lsdException w:name="Medium Shading 1" w:semiHidden="0" w:uiPriority="63" w:unhideWhenUsed="0"/>
+    <w:lsdException w:name="Medium Shading 2" w:semiHidden="0" w:uiPriority="64" w:unhideWhenUsed="0"/>
+    <w:lsdException w:name="Medium List 1" w:semiHidden="0" w:uiPriority="65" w:unhideWhenUsed="0"/>
+    <w:lsdException w:name="Medium List 2" w:semiHidden="0" w:uiPriority="66" w:unhideWhenUsed="0"/>
+    <w:lsdException w:name="Medium Grid 1" w:semiHidden="0" w:uiPriority="67" w:unhideWhenUsed="0"/>
+    <w:lsdException w:name="Medium Grid 2" w:semiHidden="0" w:uiPriority="68" w:unhideWhenUsed="0"/>
+    <w:lsdException w:name="Medium Grid 3" w:semiHidden="0" w:uiPriority="69" w:unhideWhenUsed="0"/>
+    <w:lsdException w:name="Dark List" w:semiHidden="0" w:uiPriority="70" w:unhideWhenUsed="0"/>
+    <w:lsdException w:name="Colorful Shading" w:semiHidden="0" w:uiPriority="71" w:unhideWhenUsed="0"/>
+    <w:lsdException w:name="Colorful List" w:semiHidden="0" w:uiPriority="72" w:unhideWhenUsed="0"/>
+    <w:lsdException w:name="Colorful Grid" w:semiHidden="0" w:uiPriority="73" w:unhideWhenUsed="0"/>
+    <w:lsdException w:name="Light Shading Accent 1" w:semiHidden="0" w:uiPriority="60" w:unhideWhenUsed="0"/>
+    <w:lsdException w:name="Light List Accent 1" w:semiHidden="0" w:uiPriority="61" w:unhideWhenUsed="0"/>
+    <w:lsdException w:name="Light Grid Accent 1" w:semiHidden="0" w:uiPriority="62" w:unhideWhenUsed="0"/>
+    <w:lsdException w:name="Medium Shading 1 Accent 1" w:semiHidden="0" w:uiPriority="63" w:unhideWhenUsed="0"/>
+    <w:lsdException w:name="Medium Shading 2 Accent 1" w:semiHidden="0" w:uiPriority="64" w:unhideWhenUsed="0"/>
+    <w:lsdException w:name="Medium List 1 Accent 1" w:semiHidden="0" w:uiPriority="65" w:unhideWhenUsed="0"/>
+    <w:lsdException w:name="Revision" w:unhideWhenUsed="0"/>
+    <w:lsdException w:name="List Paragraph" w:semiHidden="0" w:uiPriority="34" w:unhideWhenUsed="0" w:qFormat="1"/>
+    <w:lsdException w:name="Quote" w:semiHidden="0" w:uiPriority="29" w:unhideWhenUsed="0" w:qFormat="1"/>
+    <w:lsdException w:name="Intense Quote" w:semiHidden="0" w:uiPriority="30" w:unhideWhenUsed="0" w:qFormat="1"/>
+    <w:lsdException w:name="Medium List 2 Accent 1" w:semiHidden="0" w:uiPriority="66" w:unhideWhenUsed="0"/>
+    <w:lsdException w:name="Medium Grid 1 Accent 1" w:semiHidden="0" w:uiPriority="67" w:unhideWhenUsed="0"/>
+    <w:lsdException w:name="Medium Grid 2 Accent 1" w:semiHidden="0" w:uiPriority="68" w:unhideWhenUsed="0"/>
+    <w:lsdException w:name="Medium Grid 3 Accent 1" w:semiHidden="0" w:uiPriority="69" w:unhideWhenUsed="0"/>
+    <w:lsdException w:name="Dark List Accent 1" w:semiHidden="0" w:uiPriority="70" w:unhideWhenUsed="0"/>
+    <w:lsdException w:name="Colorful Shading Accent 1" w:semiHidden="0" w:uiPriority="71" w:unhideWhenUsed="0"/>
+    <w:lsdException w:name="Colorful List Accent 1" w:semiHidden="0" w:uiPriority="72" w:unhideWhenUsed="0"/>
+    <w:lsdException w:name="Colorful Grid Accent 1" w:semiHidden="0" w:uiPriority="73" w:unhideWhenUsed="0"/>
+    <w:lsdException w:name="Light Shading Accent 2" w:semiHidden="0" w:uiPriority="60" w:unhideWhenUsed="0"/>
+    <w:lsdException w:name="Light List Accent 2" w:semiHidden="0" w:uiPriority="61" w:unhideWhenUsed="0"/>
+    <w:lsdException w:name="Light Grid Accent 2" w:semiHidden="0" w:uiPriority="62" w:unhideWhenUsed="0"/>
+    <w:lsdException w:name="Medium Shading 1 Accent 2" w:semiHidden="0" w:uiPriority="63" w:unhideWhenUsed="0"/>
+    <w:lsdException w:name="Medium Shading 2 Accent 2" w:semiHidden="0" w:uiPriority="64" w:unhideWhenUsed="0"/>
+    <w:lsdException w:name="Medium List 1 Accent 2" w:semiHidden="0" w:uiPriority="65" w:unhideWhenUsed="0"/>
+    <w:lsdException w:name="Medium List 2 Accent 2" w:semiHidden="0" w:uiPriority="66" w:unhideWhenUsed="0"/>
+    <w:lsdException w:name="Medium Grid 1 Accent 2" w:semiHidden="0" w:uiPriority="67" w:unhideWhenUsed="0"/>
+    <w:lsdException w:name="Medium Grid 2 Accent 2" w:semiHidden="0" w:uiPriority="68" w:unhideWhenUsed="0"/>
+    <w:lsdException w:name="Medium Grid 3 Accent 2" w:semiHidden="0" w:uiPriority="69" w:unhideWhenUsed="0"/>
+    <w:lsdException w:name="Dark List Accent 2" w:semiHidden="0" w:uiPriority="70" w:unhideWhenUsed="0"/>
+    <w:lsdException w:name="Colorful Shading Accent 2" w:semiHidden="0" w:uiPriority="71" w:unhideWhenUsed="0"/>
+    <w:lsdException w:name="Colorful List Accent 2" w:semiHidden="0" w:uiPriority="72" w:unhideWhenUsed="0"/>
+    <w:lsdException w:name="Colorful Grid Accent 2" w:semiHidden="0" w:uiPriority="73" w:unhideWhenUsed="0"/>
+    <w:lsdException w:name="Light Shading Accent 3" w:semiHidden="0" w:uiPriority="60" w:unhideWhenUsed="0"/>
+    <w:lsdException w:name="Light List Accent 3" w:semiHidden="0" w:uiPriority="61" w:unhideWhenUsed="0"/>
+    <w:lsdException w:name="Light Grid Accent 3" w:semiHidden="0" w:uiPriority="62" w:unhideWhenUsed="0"/>
+    <w:lsdException w:name="Medium Shading 1 Accent 3" w:semiHidden="0" w:uiPriority="63" w:unhideWhenUsed="0"/>
+    <w:lsdException w:name="Medium Shading 2 Accent 3" w:semiHidden="0" w:uiPriority="64" w:unhideWhenUsed="0"/>
+    <w:lsdException w:name="Medium List 1 Accent 3" w:semiHidden="0" w:uiPriority="65" w:unhideWhenUsed="0"/>
+    <w:lsdException w:name="Medium List 2 Accent 3" w:semiHidden="0" w:uiPriority="66" w:unhideWhenUsed="0"/>
+    <w:lsdException w:name="Medium Grid 1 Accent 3" w:semiHidden="0" w:uiPriority="67" w:unhideWhenUsed="0"/>
+    <w:lsdException w:name="Medium Grid 2 Accent 3" w:semiHidden="0" w:uiPriority="68" w:unhideWhenUsed="0"/>
+    <w:lsdException w:name="Medium Grid 3 Accent 3" w:semiHidden="0" w:uiPriority="69" w:unhideWhenUsed="0"/>
+    <w:lsdException w:name="Dark List Accent 3" w:semiHidden="0" w:uiPriority="70" w:unhideWhenUsed="0"/>
+    <w:lsdException w:name="Colorful Shading Accent 3" w:semiHidden="0" w:uiPriority="71" w:unhideWhenUsed="0"/>
+    <w:lsdException w:name="Colorful List Accent 3" w:semiHidden="0" w:uiPriority="72" w:unhideWhenUsed="0"/>
+    <w:lsdException w:name="Colorful Grid Accent 3" w:semiHidden="0" w:uiPriority="73" w:unhideWhenUsed="0"/>
+    <w:lsdException w:name="Light Shading Accent 4" w:semiHidden="0" w:uiPriority="60" w:unhideWhenUsed="0"/>
+    <w:lsdException w:name="Light List Accent 4" w:semiHidden="0" w:uiPriority="61" w:unhideWhenUsed="0"/>
+    <w:lsdException w:name="Light Grid Accent 4" w:semiHidden="0" w:uiPriority="62" w:unhideWhenUsed="0"/>
+    <w:lsdException w:name="Medium Shading 1 Accent 4" w:semiHidden="0" w:uiPriority="63" w:unhideWhenUsed="0"/>
+    <w:lsdException w:name="Medium Shading 2 Accent 4" w:semiHidden="0" w:uiPriority="64" w:unhideWhenUsed="0"/>
+    <w:lsdException w:name="Medium List 1 Accent 4" w:semiHidden="0" w:uiPriority="65" w:unhideWhenUsed="0"/>
+    <w:lsdException w:name="Medium List 2 Accent 4" w:semiHidden="0" w:uiPriority="66" w:unhideWhenUsed="0"/>
+    <w:lsdException w:name="Medium Grid 1 Accent 4" w:semiHidden="0" w:uiPriority="67" w:unhideWhenUsed="0"/>
+    <w:lsdException w:name="Medium Grid 2 Accent 4" w:semiHidden="0" w:uiPriority="68" w:unhideWhenUsed="0"/>
+    <w:lsdException w:name="Medium Grid 3 Accent 4" w:semiHidden="0" w:uiPriority="69" w:unhideWhenUsed="0"/>
+    <w:lsdException w:name="Dark List Accent 4" w:semiHidden="0" w:uiPriority="70" w:unhideWhenUsed="0"/>
+    <w:lsdException w:name="Colorful Shading Accent 4" w:semiHidden="0" w:uiPriority="71" w:unhideWhenUsed="0"/>
+    <w:lsdException w:name="Colorful List Accent 4" w:semiHidden="0" w:uiPriority="72" w:unhideWhenUsed="0"/>
+    <w:lsdException w:name="Colorful Grid Accent 4" w:semiHidden="0" w:uiPriority="73" w:unhideWhenUsed="0"/>
+    <w:lsdException w:name="Light Shading Accent 5" w:semiHidden="0" w:uiPriority="60" w:unhideWhenUsed="0"/>
+    <w:lsdException w:name="Light List Accent 5" w:semiHidden="0" w:uiPriority="61" w:unhideWhenUsed="0"/>
+    <w:lsdException w:name="Light Grid Accent 5" w:semiHidden="0" w:uiPriority="62" w:unhideWhenUsed="0"/>
+    <w:lsdException w:name="Medium Shading 1 Accent 5" w:semiHidden="0" w:uiPriority="63" w:unhideWhenUsed="0"/>
+    <w:lsdException w:name="Medium Shading 2 Accent 5" w:semiHidden="0" w:uiPriority="64" w:unhideWhenUsed="0"/>
+    <w:lsdException w:name="Medium List 1 Accent 5" w:semiHidden="0" w:uiPriority="65" w:unhideWhenUsed="0"/>
+    <w:lsdException w:name="Medium List 2 Accent 5" w:semiHidden="0" w:uiPriority="66" w:unhideWhenUsed="0"/>
+    <w:lsdException w:name="Medium Grid 1 Accent 5" w:semiHidden="0" w:uiPriority="67" w:unhideWhenUsed="0"/>
+    <w:lsdException w:name="Medium Grid 2 Accent 5" w:semiHidden="0" w:uiPriority="68" w:unhideWhenUsed="0"/>
+    <w:lsdException w:name="Medium Grid 3 Accent 5" w:semiHidden="0" w:uiPriority="69" w:unhideWhenUsed="0"/>
+    <w:lsdException w:name="Dark List Accent 5" w:semiHidden="0" w:uiPriority="70" w:unhideWhenUsed="0"/>
+    <w:lsdException w:name="Colorful Shading Accent 5" w:semiHidden="0" w:uiPriority="71" w:unhideWhenUsed="0"/>
+    <w:lsdException w:name="Colorful List Accent 5" w:semiHidden="0" w:uiPriority="72" w:unhideWhenUsed="0"/>
+    <w:lsdException w:name="Colorful Grid Accent 5" w:semiHidden="0" w:uiPriority="73" w:unhideWhenUsed="0"/>
+    <w:lsdException w:name="Light Shading Accent 6" w:semiHidden="0" w:uiPriority="60" w:unhideWhenUsed="0"/>
+    <w:lsdException w:name="Light List Accent 6" w:semiHidden="0" w:uiPriority="61" w:unhideWhenUsed="0"/>
+    <w:lsdException w:name="Light Grid Accent 6" w:semiHidden="0" w:uiPriority="62" w:unhideWhenUsed="0"/>
+    <w:lsdException w:name="Medium Shading 1 Accent 6" w:semiHidden="0" w:uiPriority="63" w:unhideWhenUsed="0"/>
+    <w:lsdException w:name="Medium Shading 2 Accent 6" w:semiHidden="0" w:uiPriority="64" w:unhideWhenUsed="0"/>
+    <w:lsdException w:name="Medium List 1 Accent 6" w:semiHidden="0" w:uiPriority="65" w:unhideWhenUsed="0"/>
+    <w:lsdException w:name="Medium List 2 Accent 6" w:semiHidden="0" w:uiPriority="66" w:unhideWhenUsed="0"/>
+    <w:lsdException w:name="Medium Grid 1 Accent 6" w:semiHidden="0" w:uiPriority="67" w:unhideWhenUsed="0"/>
+    <w:lsdException w:name="Medium Grid 2 Accent 6" w:semiHidden="0" w:uiPriority="68" w:unhideWhenUsed="0"/>
+    <w:lsdException w:name="Medium Grid 3 Accent 6" w:semiHidden="0" w:uiPriority="69" w:unhideWhenUsed="0"/>
+    <w:lsdException w:name="Dark List Accent 6" w:semiHidden="0" w:uiPriority="70" w:unhideWhenUsed="0"/>
+    <w:lsdException w:name="Colorful Shading Accent 6" w:semiHidden="0" w:uiPriority="71" w:unhideWhenUsed="0"/>
+    <w:lsdException w:name="Colorful List Accent 6" w:semiHidden="0" w:uiPriority="72" w:unhideWhenUsed="0"/>
+    <w:lsdException w:name="Colorful Grid Accent 6" w:semiHidden="0" w:uiPriority="73" w:unhideWhenUsed="0"/>
+    <w:lsdException w:name="Subtle Emphasis" w:semiHidden="0" w:uiPriority="19" w:unhideWhenUsed="0" w:qFormat="1"/>
+    <w:lsdException w:name="Intense Emphasis" w:semiHidden="0" w:uiPriority="21" w:unhideWhenUsed="0" w:qFormat="1"/>
+    <w:lsdException w:name="Subtle Reference" w:semiHidden="0" w:uiPriority="31" w:unhideWhenUsed="0" w:qFormat="1"/>
+    <w:lsdException w:name="Intense Reference" w:semiHidden="0" w:uiPriority="32" w:unhideWhenUsed="0" w:qFormat="1"/>
+    <w:lsdException w:name="Book Title" w:semiHidden="0" w:uiPriority="33" w:unhideWhenUsed="0" w:qFormat="1"/>
+    <w:lsdException w:name="Bibliography" w:uiPriority="37"/>
+    <w:lsdException w:name="TOC Heading" w:uiPriority="39" w:qFormat="1"/>
+  </w:latentStyles>
+  <w:style w:type="paragraph" w:default="1" w:styleId="Normal">
+    <w:name w:val="Normal"/>
+    <w:qFormat/>
+  </w:style>
+  <w:style w:type="character" w:default="1" w:styleId="DefaultParagraphFont">
+    <w:name w:val="Default Paragraph Font"/>
+    <w:uiPriority w:val="1"/>
+    <w:semiHidden/>
+    <w:unhideWhenUsed/>
+  </w:style>
+  <w:style w:type="table" w:default="1" w:styleId="TableNormal">
+    <w:name w:val="Normal Table"/>
+    <w:uiPriority w:val="99"/>
+    <w:semiHidden/>
+    <w:unhideWhenUsed/>
+    <w:tblPr>
+      <w:tblInd w:w="0" w:type="dxa"/>
+      <w:tblCellMar>
+        <w:top w:w="0" w:type="dxa"/>
+        <w:left w:w="108" w:type="dxa"/>
+        <w:bottom w:w="0" w:type="dxa"/>
+        <w:right w:w="108" w:type="dxa"/>
+      </w:tblCellMar>
+    </w:tblPr>
+  </w:style>
+  <w:style w:type="numbering" w:default="1" w:styleId="NoList">
+    <w:name w:val="No List"/>
+    <w:uiPriority w:val="99"/>
+    <w:semiHidden/>
+    <w:unhideWhenUsed/>
   </w:style>
 </w:styles>
 </file>
@@ -4164,7 +4140,7 @@
   <a:extraClrSchemeLst/>
   <a:extLst>
     <a:ext uri="{05A4C25C-085E-4340-85A3-A5531E510DB2}">
-      <thm15:themeFamily xmlns:thm15="http://schemas.microsoft.com/office/thememl/2012/main" name="Office Theme" id="{2E142A2C-CD16-42D6-873A-C26D2A0506FA}" vid="{1BDDFF52-6CD6-40A5-AB3C-68EB2F1E4D0A}"/>
+      <thm15:themeFamily xmlns:thm15="http://schemas.microsoft.com/office/thememl/2012/main" xmlns="" name="Office Theme" id="{2E142A2C-CD16-42D6-873A-C26D2A0506FA}" vid="{1BDDFF52-6CD6-40A5-AB3C-68EB2F1E4D0A}"/>
     </a:ext>
   </a:extLst>
 </a:theme>
@@ -4175,7 +4151,7 @@
 </file>
 
 <file path=customXml/itemProps1.xml><?xml version="1.0" encoding="utf-8"?>
-<ds:datastoreItem xmlns:ds="http://schemas.openxmlformats.org/officeDocument/2006/customXml" ds:itemID="{74D0FB0D-4AD1-45DA-8BF0-4B0AC46C461D}">
+<ds:datastoreItem xmlns:ds="http://schemas.openxmlformats.org/officeDocument/2006/customXml" ds:itemID="{5DFB42B2-B06C-4417-B3DE-E56A89CD51B3}">
   <ds:schemaRefs>
     <ds:schemaRef ds:uri="http://schemas.openxmlformats.org/officeDocument/2006/bibliography"/>
   </ds:schemaRefs>

</xml_diff>